<commit_message>
Replace portfolio resume document
</commit_message>
<xml_diff>
--- a/images/Ziv_Cohen_2026_Resume.docx
+++ b/images/Ziv_Cohen_2026_Resume.docx
@@ -472,7 +472,7 @@
     <w:p>
       <w:pPr>
         <w:tabs>
-          <w:tab w:val="right" w:pos="10710"/>
+          <w:tab w:val="right" w:pos="8730"/>
         </w:tabs>
         <w:spacing w:line="240" w:lineRule="auto"/>
         <w:rPr>
@@ -489,25 +489,16 @@
           <w:sz w:val="20"/>
           <w:szCs w:val="20"/>
         </w:rPr>
-        <w:t>Clip</w:t>
-      </w:r>
-      <w:r>
-        <w:rPr>
-          <w:rFonts w:ascii="Calibri" w:eastAsia="Spectral" w:hAnsi="Calibri" w:cs="Calibri"/>
-          <w:b/>
-          <w:sz w:val="20"/>
-          <w:szCs w:val="20"/>
-        </w:rPr>
-        <w:t xml:space="preserve"> </w:t>
-      </w:r>
-      <w:r>
-        <w:rPr>
-          <w:rFonts w:ascii="Calibri" w:eastAsia="Spectral" w:hAnsi="Calibri" w:cs="Calibri"/>
-          <w:b/>
-          <w:sz w:val="20"/>
-          <w:szCs w:val="20"/>
-        </w:rPr>
-        <w:t xml:space="preserve">It! </w:t>
+        <w:t>Garmi</w:t>
+      </w:r>
+      <w:r>
+        <w:rPr>
+          <w:rFonts w:ascii="Calibri" w:eastAsia="Spectral" w:hAnsi="Calibri" w:cs="Calibri"/>
+          <w:b/>
+          <w:sz w:val="20"/>
+          <w:szCs w:val="20"/>
+        </w:rPr>
+        <w:t>n</w:t>
       </w:r>
       <w:r>
         <w:rPr>
@@ -517,7 +508,16 @@
           <w:szCs w:val="20"/>
         </w:rPr>
         <w:tab/>
-        <w:t>Lawrence, KS</w:t>
+      </w:r>
+      <w:r>
+        <w:rPr>
+          <w:rFonts w:ascii="Calibri" w:eastAsia="Spectral" w:hAnsi="Calibri" w:cs="Calibri"/>
+          <w:b/>
+          <w:sz w:val="20"/>
+          <w:szCs w:val="20"/>
+        </w:rPr>
+        <w:tab/>
+        <w:t xml:space="preserve">            Olathe, KS</w:t>
       </w:r>
     </w:p>
     <w:p>
@@ -528,13 +528,22 @@
         <w:spacing w:line="240" w:lineRule="auto"/>
         <w:rPr>
           <w:rFonts w:ascii="Calibri" w:eastAsia="Spectral" w:hAnsi="Calibri" w:cs="Calibri"/>
-          <w:bCs/>
+          <w:b/>
+          <w:sz w:val="20"/>
+          <w:szCs w:val="20"/>
+        </w:rPr>
+      </w:pPr>
+      <w:r>
+        <w:rPr>
+          <w:rFonts w:ascii="Calibri" w:eastAsia="Spectral" w:hAnsi="Calibri" w:cs="Calibri"/>
+          <w:b/>
           <w:i/>
           <w:iCs/>
           <w:sz w:val="20"/>
           <w:szCs w:val="20"/>
         </w:rPr>
-      </w:pPr>
+        <w:t xml:space="preserve">Aviation </w:t>
+      </w:r>
       <w:r>
         <w:rPr>
           <w:rFonts w:ascii="Calibri" w:eastAsia="Spectral" w:hAnsi="Calibri" w:cs="Calibri"/>
@@ -544,7 +553,7 @@
           <w:sz w:val="20"/>
           <w:szCs w:val="20"/>
         </w:rPr>
-        <w:t>B</w:t>
+        <w:t>Software Engineering</w:t>
       </w:r>
       <w:r>
         <w:rPr>
@@ -555,7 +564,7 @@
           <w:sz w:val="20"/>
           <w:szCs w:val="20"/>
         </w:rPr>
-        <w:t>usiness Development Lea</w:t>
+        <w:t xml:space="preserve"> Inter</w:t>
       </w:r>
       <w:r>
         <w:rPr>
@@ -566,38 +575,27 @@
           <w:sz w:val="20"/>
           <w:szCs w:val="20"/>
         </w:rPr>
-        <w:t>d &amp; Cofoun</w:t>
-      </w:r>
-      <w:r>
-        <w:rPr>
-          <w:rFonts w:ascii="Calibri" w:eastAsia="Spectral" w:hAnsi="Calibri" w:cs="Calibri"/>
-          <w:b/>
+        <w:t>n</w:t>
+      </w:r>
+      <w:r>
+        <w:rPr>
+          <w:rFonts w:ascii="Calibri" w:eastAsia="Spectral" w:hAnsi="Calibri" w:cs="Calibri"/>
+          <w:b/>
+          <w:sz w:val="20"/>
+          <w:szCs w:val="20"/>
+        </w:rPr>
+        <w:tab/>
+      </w:r>
+      <w:r>
+        <w:rPr>
+          <w:rFonts w:ascii="Calibri" w:eastAsia="Spectral" w:hAnsi="Calibri" w:cs="Calibri"/>
+          <w:bCs/>
           <w:i/>
           <w:iCs/>
           <w:sz w:val="20"/>
           <w:szCs w:val="20"/>
         </w:rPr>
-        <w:t>der</w:t>
-      </w:r>
-      <w:r>
-        <w:rPr>
-          <w:rFonts w:ascii="Calibri" w:eastAsia="Spectral" w:hAnsi="Calibri" w:cs="Calibri"/>
-          <w:b/>
-          <w:sz w:val="20"/>
-          <w:szCs w:val="20"/>
-        </w:rPr>
-        <w:tab/>
-      </w:r>
-      <w:r>
-        <w:rPr>
-          <w:rFonts w:ascii="Calibri" w:eastAsia="Spectral" w:hAnsi="Calibri" w:cs="Calibri"/>
-          <w:bCs/>
-          <w:i/>
-          <w:iCs/>
-          <w:sz w:val="20"/>
-          <w:szCs w:val="20"/>
-        </w:rPr>
-        <w:t>August 2026-Present</w:t>
+        <w:t>May 2026-August 2026</w:t>
       </w:r>
     </w:p>
     <w:p>
@@ -626,7 +624,7 @@
           <w:sz w:val="20"/>
           <w:szCs w:val="20"/>
         </w:rPr>
-        <w:t>Lead business development for an early-stage technology venture developing an automated video-capture solution for independent entertainment venues</w:t>
+        <w:t>Redesigned audit sampling system to expand data coverage and automate report generation, cutting review time by 50%+</w:t>
       </w:r>
     </w:p>
     <w:p>
@@ -655,34 +653,7 @@
           <w:sz w:val="20"/>
           <w:szCs w:val="20"/>
         </w:rPr>
-        <w:t xml:space="preserve">Research venue workflows and customer </w:t>
-      </w:r>
-      <w:r>
-        <w:rPr>
-          <w:rFonts w:ascii="Calibri" w:eastAsia="Spectral" w:hAnsi="Calibri" w:cs="Calibri"/>
-          <w:bCs/>
-          <w:sz w:val="20"/>
-          <w:szCs w:val="20"/>
-        </w:rPr>
-        <w:t>requirements</w:t>
-      </w:r>
-      <w:r>
-        <w:rPr>
-          <w:rFonts w:ascii="Calibri" w:eastAsia="Spectral" w:hAnsi="Calibri" w:cs="Calibri"/>
-          <w:bCs/>
-          <w:sz w:val="20"/>
-          <w:szCs w:val="20"/>
-        </w:rPr>
-        <w:t xml:space="preserve"> to identify early adopters and shape initial go-to-market and partnership strate</w:t>
-      </w:r>
-      <w:r>
-        <w:rPr>
-          <w:rFonts w:ascii="Calibri" w:eastAsia="Spectral" w:hAnsi="Calibri" w:cs="Calibri"/>
-          <w:bCs/>
-          <w:sz w:val="20"/>
-          <w:szCs w:val="20"/>
-        </w:rPr>
-        <w:t>gies</w:t>
+        <w:t>Extended Python-based document automation pipeline to scope compliance reports exclusively to DO-178C-supported components, eliminating manual filtering</w:t>
       </w:r>
     </w:p>
     <w:p>
@@ -711,58 +682,7 @@
           <w:sz w:val="20"/>
           <w:szCs w:val="20"/>
         </w:rPr>
-        <w:t>Translate prospective customer requirements into product specifications while collaborating with the technical team to develop and validate the prototype</w:t>
-      </w:r>
-    </w:p>
-    <w:p>
-      <w:pPr>
-        <w:tabs>
-          <w:tab w:val="right" w:pos="8730"/>
-        </w:tabs>
-        <w:spacing w:line="240" w:lineRule="auto"/>
-        <w:rPr>
-          <w:rFonts w:ascii="Calibri" w:eastAsia="Spectral" w:hAnsi="Calibri" w:cs="Calibri"/>
-          <w:b/>
-          <w:sz w:val="20"/>
-          <w:szCs w:val="20"/>
-        </w:rPr>
-      </w:pPr>
-      <w:r>
-        <w:rPr>
-          <w:rFonts w:ascii="Calibri" w:eastAsia="Spectral" w:hAnsi="Calibri" w:cs="Calibri"/>
-          <w:b/>
-          <w:sz w:val="20"/>
-          <w:szCs w:val="20"/>
-        </w:rPr>
-        <w:t>Garmi</w:t>
-      </w:r>
-      <w:r>
-        <w:rPr>
-          <w:rFonts w:ascii="Calibri" w:eastAsia="Spectral" w:hAnsi="Calibri" w:cs="Calibri"/>
-          <w:b/>
-          <w:sz w:val="20"/>
-          <w:szCs w:val="20"/>
-        </w:rPr>
-        <w:t>n</w:t>
-      </w:r>
-      <w:r>
-        <w:rPr>
-          <w:rFonts w:ascii="Calibri" w:eastAsia="Spectral" w:hAnsi="Calibri" w:cs="Calibri"/>
-          <w:b/>
-          <w:sz w:val="20"/>
-          <w:szCs w:val="20"/>
-        </w:rPr>
-        <w:tab/>
-      </w:r>
-      <w:r>
-        <w:rPr>
-          <w:rFonts w:ascii="Calibri" w:eastAsia="Spectral" w:hAnsi="Calibri" w:cs="Calibri"/>
-          <w:b/>
-          <w:sz w:val="20"/>
-          <w:szCs w:val="20"/>
-        </w:rPr>
-        <w:tab/>
-        <w:t xml:space="preserve">            Olathe, KS</w:t>
+        <w:t>Collaborated with SQA and engineering stakeholders within a large enterprise codebase to improve release and compliance workflows using Python, Git, YAML, and Jira</w:t>
       </w:r>
     </w:p>
     <w:p>
@@ -782,13 +702,37 @@
         <w:rPr>
           <w:rFonts w:ascii="Calibri" w:eastAsia="Spectral" w:hAnsi="Calibri" w:cs="Calibri"/>
           <w:b/>
+          <w:sz w:val="20"/>
+          <w:szCs w:val="20"/>
+        </w:rPr>
+        <w:t xml:space="preserve">Clip It! </w:t>
+      </w:r>
+      <w:r>
+        <w:rPr>
+          <w:rFonts w:ascii="Calibri" w:eastAsia="Spectral" w:hAnsi="Calibri" w:cs="Calibri"/>
+          <w:b/>
+          <w:sz w:val="20"/>
+          <w:szCs w:val="20"/>
+        </w:rPr>
+        <w:tab/>
+        <w:t>Lawrence, KS</w:t>
+      </w:r>
+    </w:p>
+    <w:p>
+      <w:pPr>
+        <w:tabs>
+          <w:tab w:val="right" w:pos="10710"/>
+        </w:tabs>
+        <w:spacing w:line="240" w:lineRule="auto"/>
+        <w:rPr>
+          <w:rFonts w:ascii="Calibri" w:eastAsia="Spectral" w:hAnsi="Calibri" w:cs="Calibri"/>
+          <w:bCs/>
           <w:i/>
           <w:iCs/>
           <w:sz w:val="20"/>
           <w:szCs w:val="20"/>
         </w:rPr>
-        <w:t xml:space="preserve">Aviation </w:t>
-      </w:r>
+      </w:pPr>
       <w:r>
         <w:rPr>
           <w:rFonts w:ascii="Calibri" w:eastAsia="Spectral" w:hAnsi="Calibri" w:cs="Calibri"/>
@@ -798,49 +742,27 @@
           <w:sz w:val="20"/>
           <w:szCs w:val="20"/>
         </w:rPr>
-        <w:t>Software Engineering</w:t>
-      </w:r>
-      <w:r>
-        <w:rPr>
-          <w:rFonts w:ascii="Calibri" w:eastAsia="Spectral" w:hAnsi="Calibri" w:cs="Calibri"/>
-          <w:b/>
+        <w:t>Business Development Lead &amp; Cofounder</w:t>
+      </w:r>
+      <w:r>
+        <w:rPr>
+          <w:rFonts w:ascii="Calibri" w:eastAsia="Spectral" w:hAnsi="Calibri" w:cs="Calibri"/>
+          <w:b/>
+          <w:sz w:val="20"/>
+          <w:szCs w:val="20"/>
+        </w:rPr>
+        <w:tab/>
+      </w:r>
+      <w:r>
+        <w:rPr>
+          <w:rFonts w:ascii="Calibri" w:eastAsia="Spectral" w:hAnsi="Calibri" w:cs="Calibri"/>
+          <w:bCs/>
           <w:i/>
           <w:iCs/>
           <w:sz w:val="20"/>
           <w:szCs w:val="20"/>
         </w:rPr>
-        <w:t xml:space="preserve"> Inter</w:t>
-      </w:r>
-      <w:r>
-        <w:rPr>
-          <w:rFonts w:ascii="Calibri" w:eastAsia="Spectral" w:hAnsi="Calibri" w:cs="Calibri"/>
-          <w:b/>
-          <w:i/>
-          <w:iCs/>
-          <w:sz w:val="20"/>
-          <w:szCs w:val="20"/>
-        </w:rPr>
-        <w:t>n</w:t>
-      </w:r>
-      <w:r>
-        <w:rPr>
-          <w:rFonts w:ascii="Calibri" w:eastAsia="Spectral" w:hAnsi="Calibri" w:cs="Calibri"/>
-          <w:b/>
-          <w:sz w:val="20"/>
-          <w:szCs w:val="20"/>
-        </w:rPr>
-        <w:tab/>
-      </w:r>
-      <w:r>
-        <w:rPr>
-          <w:rFonts w:ascii="Calibri" w:eastAsia="Spectral" w:hAnsi="Calibri" w:cs="Calibri"/>
-          <w:bCs/>
-          <w:i/>
-          <w:iCs/>
-          <w:sz w:val="20"/>
-          <w:szCs w:val="20"/>
-        </w:rPr>
-        <w:t>May 2026-August 2026</w:t>
+        <w:t>August 2026-Present</w:t>
       </w:r>
     </w:p>
     <w:p>
@@ -869,7 +791,7 @@
           <w:sz w:val="20"/>
           <w:szCs w:val="20"/>
         </w:rPr>
-        <w:t>Redesigned audit sampling system to expand data coverage and automate report generation, cutting review time by 50%+</w:t>
+        <w:t>Lead business development for an early-stage technology venture developing an automated video-capture solution for independent entertainment venues</w:t>
       </w:r>
     </w:p>
     <w:p>
@@ -898,7 +820,36 @@
           <w:sz w:val="20"/>
           <w:szCs w:val="20"/>
         </w:rPr>
-        <w:t>Extended Python-based document automation pipeline to scope compliance reports exclusively to DO-178C-supported components, eliminating manual filtering</w:t>
+        <w:t xml:space="preserve">Research </w:t>
+      </w:r>
+      <w:proofErr w:type="gramStart"/>
+      <w:r>
+        <w:rPr>
+          <w:rFonts w:ascii="Calibri" w:eastAsia="Spectral" w:hAnsi="Calibri" w:cs="Calibri"/>
+          <w:bCs/>
+          <w:sz w:val="20"/>
+          <w:szCs w:val="20"/>
+        </w:rPr>
+        <w:t>venue</w:t>
+      </w:r>
+      <w:r>
+        <w:rPr>
+          <w:rFonts w:ascii="Calibri" w:eastAsia="Spectral" w:hAnsi="Calibri" w:cs="Calibri"/>
+          <w:bCs/>
+          <w:sz w:val="20"/>
+          <w:szCs w:val="20"/>
+        </w:rPr>
+        <w:t>’s</w:t>
+      </w:r>
+      <w:proofErr w:type="gramEnd"/>
+      <w:r>
+        <w:rPr>
+          <w:rFonts w:ascii="Calibri" w:eastAsia="Spectral" w:hAnsi="Calibri" w:cs="Calibri"/>
+          <w:bCs/>
+          <w:sz w:val="20"/>
+          <w:szCs w:val="20"/>
+        </w:rPr>
+        <w:t xml:space="preserve"> and customer requirements to identify early adopters and shape initial go-to-market and partnership strategies</w:t>
       </w:r>
     </w:p>
     <w:p>
@@ -927,7 +878,7 @@
           <w:sz w:val="20"/>
           <w:szCs w:val="20"/>
         </w:rPr>
-        <w:t>Collaborated with SQA and engineering stakeholders within a large enterprise codebase to improve release and compliance workflows using Python, Git, YAML, and Jira</w:t>
+        <w:t>Translate prospective customer requirements into product specifications while collaborating with the technical team to develop and validate the prototype</w:t>
       </w:r>
     </w:p>
     <w:p>
@@ -1063,7 +1014,9 @@
         <w:spacing w:line="240" w:lineRule="auto"/>
         <w:rPr>
           <w:rFonts w:ascii="Calibri" w:eastAsia="Spectral" w:hAnsi="Calibri" w:cs="Calibri"/>
-          <w:bCs/>
+          <w:b/>
+          <w:i/>
+          <w:iCs/>
           <w:sz w:val="20"/>
           <w:szCs w:val="20"/>
         </w:rPr>
@@ -1153,283 +1106,6 @@
     </w:p>
     <w:p>
       <w:pPr>
-        <w:tabs>
-          <w:tab w:val="right" w:pos="8730"/>
-        </w:tabs>
-        <w:spacing w:line="240" w:lineRule="auto"/>
-        <w:rPr>
-          <w:rFonts w:ascii="Calibri" w:eastAsia="Spectral" w:hAnsi="Calibri" w:cs="Calibri"/>
-          <w:bCs/>
-          <w:sz w:val="20"/>
-          <w:szCs w:val="20"/>
-        </w:rPr>
-      </w:pPr>
-      <w:r>
-        <w:rPr>
-          <w:rFonts w:ascii="Calibri" w:eastAsia="Spectral" w:hAnsi="Calibri" w:cs="Calibri"/>
-          <w:bCs/>
-          <w:sz w:val="20"/>
-          <w:szCs w:val="20"/>
-        </w:rPr>
-        <w:t>Collaborat</w:t>
-      </w:r>
-      <w:r>
-        <w:rPr>
-          <w:rFonts w:ascii="Calibri" w:eastAsia="Spectral" w:hAnsi="Calibri" w:cs="Calibri"/>
-          <w:bCs/>
-          <w:sz w:val="20"/>
-          <w:szCs w:val="20"/>
-        </w:rPr>
-        <w:t>ed</w:t>
-      </w:r>
-      <w:r>
-        <w:rPr>
-          <w:rFonts w:ascii="Calibri" w:eastAsia="Spectral" w:hAnsi="Calibri" w:cs="Calibri"/>
-          <w:bCs/>
-          <w:sz w:val="20"/>
-          <w:szCs w:val="20"/>
-        </w:rPr>
-        <w:t xml:space="preserve"> with the KU School of Business to </w:t>
-      </w:r>
-      <w:r>
-        <w:rPr>
-          <w:rFonts w:ascii="Calibri" w:eastAsia="Spectral" w:hAnsi="Calibri" w:cs="Calibri"/>
-          <w:bCs/>
-          <w:sz w:val="20"/>
-          <w:szCs w:val="20"/>
-        </w:rPr>
-        <w:t>scale the venture to be</w:t>
-      </w:r>
-      <w:r>
-        <w:rPr>
-          <w:rFonts w:ascii="Calibri" w:eastAsia="Spectral" w:hAnsi="Calibri" w:cs="Calibri"/>
-          <w:bCs/>
-          <w:sz w:val="20"/>
-          <w:szCs w:val="20"/>
-        </w:rPr>
-        <w:t xml:space="preserve"> successful and</w:t>
-      </w:r>
-      <w:r>
-        <w:rPr>
-          <w:rFonts w:ascii="Calibri" w:eastAsia="Spectral" w:hAnsi="Calibri" w:cs="Calibri"/>
-          <w:bCs/>
-          <w:sz w:val="20"/>
-          <w:szCs w:val="20"/>
-        </w:rPr>
-        <w:t xml:space="preserve"> profitable</w:t>
-      </w:r>
-    </w:p>
-    <w:p>
-      <w:pPr>
-        <w:pBdr>
-          <w:bottom w:val="single" w:sz="6" w:space="1" w:color="000000"/>
-        </w:pBdr>
-        <w:spacing w:line="240" w:lineRule="auto"/>
-        <w:rPr>
-          <w:rFonts w:ascii="Calibri" w:eastAsia="Spectral" w:hAnsi="Calibri" w:cs="Calibri"/>
-          <w:b/>
-          <w:smallCaps/>
-        </w:rPr>
-      </w:pPr>
-      <w:r>
-        <w:rPr>
-          <w:rFonts w:ascii="Calibri" w:eastAsia="Spectral" w:hAnsi="Calibri" w:cs="Calibri"/>
-          <w:b/>
-          <w:smallCaps/>
-        </w:rPr>
-        <w:t>PROJECTS</w:t>
-      </w:r>
-      <w:r>
-        <w:rPr>
-          <w:rFonts w:ascii="Calibri" w:eastAsia="Spectral" w:hAnsi="Calibri" w:cs="Calibri"/>
-          <w:b/>
-          <w:smallCaps/>
-        </w:rPr>
-        <w:t xml:space="preserve"> &amp; ADDITIONAL EXPERIENCE</w:t>
-      </w:r>
-    </w:p>
-    <w:p>
-      <w:pPr>
-        <w:tabs>
-          <w:tab w:val="right" w:pos="10710"/>
-        </w:tabs>
-        <w:spacing w:line="240" w:lineRule="auto"/>
-        <w:rPr>
-          <w:rFonts w:ascii="Calibri" w:eastAsia="Spectral" w:hAnsi="Calibri" w:cs="Calibri"/>
-          <w:sz w:val="20"/>
-          <w:szCs w:val="20"/>
-          <w:lang w:val="en-US"/>
-        </w:rPr>
-      </w:pPr>
-      <w:r>
-        <w:rPr>
-          <w:rFonts w:ascii="Calibri" w:eastAsia="Spectral" w:hAnsi="Calibri" w:cs="Calibri"/>
-          <w:b/>
-          <w:bCs/>
-          <w:sz w:val="20"/>
-          <w:szCs w:val="20"/>
-          <w:lang w:val="en-US"/>
-        </w:rPr>
-        <w:t>6-DOF Teleoperated Robotic Arm</w:t>
-      </w:r>
-      <w:r>
-        <w:rPr>
-          <w:rFonts w:ascii="Calibri" w:eastAsia="Spectral" w:hAnsi="Calibri" w:cs="Calibri"/>
-          <w:b/>
-          <w:bCs/>
-          <w:sz w:val="20"/>
-          <w:szCs w:val="20"/>
-          <w:lang w:val="en-US"/>
-        </w:rPr>
-        <w:t xml:space="preserve">, </w:t>
-      </w:r>
-      <w:r>
-        <w:rPr>
-          <w:rFonts w:ascii="Calibri" w:eastAsia="Spectral" w:hAnsi="Calibri" w:cs="Calibri"/>
-          <w:i/>
-          <w:iCs/>
-          <w:sz w:val="20"/>
-          <w:szCs w:val="20"/>
-          <w:lang w:val="en-US"/>
-        </w:rPr>
-        <w:t>1</w:t>
-      </w:r>
-      <w:r>
-        <w:rPr>
-          <w:rFonts w:ascii="Calibri" w:eastAsia="Spectral" w:hAnsi="Calibri" w:cs="Calibri"/>
-          <w:i/>
-          <w:iCs/>
-          <w:sz w:val="20"/>
-          <w:szCs w:val="20"/>
-          <w:vertAlign w:val="superscript"/>
-          <w:lang w:val="en-US"/>
-        </w:rPr>
-        <w:t>st</w:t>
-      </w:r>
-      <w:r>
-        <w:rPr>
-          <w:rFonts w:ascii="Calibri" w:eastAsia="Spectral" w:hAnsi="Calibri" w:cs="Calibri"/>
-          <w:i/>
-          <w:iCs/>
-          <w:sz w:val="20"/>
-          <w:szCs w:val="20"/>
-          <w:lang w:val="en-US"/>
-        </w:rPr>
-        <w:t xml:space="preserve"> Place </w:t>
-      </w:r>
-      <w:r>
-        <w:rPr>
-          <w:rFonts w:ascii="Calibri" w:eastAsia="Spectral" w:hAnsi="Calibri" w:cs="Calibri"/>
-          <w:i/>
-          <w:iCs/>
-          <w:sz w:val="20"/>
-          <w:szCs w:val="20"/>
-          <w:lang w:val="en-US"/>
-        </w:rPr>
-        <w:t>Award Winne</w:t>
-      </w:r>
-      <w:r>
-        <w:rPr>
-          <w:rFonts w:ascii="Calibri" w:eastAsia="Spectral" w:hAnsi="Calibri" w:cs="Calibri"/>
-          <w:i/>
-          <w:iCs/>
-          <w:sz w:val="20"/>
-          <w:szCs w:val="20"/>
-          <w:lang w:val="en-US"/>
-        </w:rPr>
-        <w:t xml:space="preserve">r </w:t>
-      </w:r>
-      <w:r>
-        <w:rPr>
-          <w:rFonts w:ascii="Calibri" w:eastAsia="Spectral" w:hAnsi="Calibri" w:cs="Calibri"/>
-          <w:i/>
-          <w:iCs/>
-          <w:sz w:val="20"/>
-          <w:szCs w:val="20"/>
-          <w:lang w:val="en-US"/>
-        </w:rPr>
-        <w:t>on The Hive</w:t>
-      </w:r>
-      <w:r>
-        <w:rPr>
-          <w:rFonts w:ascii="Calibri" w:eastAsia="Spectral" w:hAnsi="Calibri" w:cs="Calibri"/>
-          <w:i/>
-          <w:iCs/>
-          <w:sz w:val="20"/>
-          <w:szCs w:val="20"/>
-          <w:lang w:val="en-US"/>
-        </w:rPr>
-        <w:tab/>
-      </w:r>
-      <w:r>
-        <w:rPr>
-          <w:rFonts w:ascii="Calibri" w:eastAsia="Spectral" w:hAnsi="Calibri" w:cs="Calibri"/>
-          <w:i/>
-          <w:iCs/>
-          <w:sz w:val="20"/>
-          <w:szCs w:val="20"/>
-          <w:lang w:val="en-US"/>
-        </w:rPr>
-        <w:t>Ju</w:t>
-      </w:r>
-      <w:r>
-        <w:rPr>
-          <w:rFonts w:ascii="Calibri" w:eastAsia="Spectral" w:hAnsi="Calibri" w:cs="Calibri"/>
-          <w:i/>
-          <w:iCs/>
-          <w:sz w:val="20"/>
-          <w:szCs w:val="20"/>
-          <w:lang w:val="en-US"/>
-        </w:rPr>
-        <w:t>ne</w:t>
-      </w:r>
-      <w:r>
-        <w:rPr>
-          <w:rFonts w:ascii="Calibri" w:eastAsia="Spectral" w:hAnsi="Calibri" w:cs="Calibri"/>
-          <w:i/>
-          <w:iCs/>
-          <w:sz w:val="20"/>
-          <w:szCs w:val="20"/>
-          <w:lang w:val="en-US"/>
-        </w:rPr>
-        <w:t xml:space="preserve"> 202</w:t>
-      </w:r>
-      <w:r>
-        <w:rPr>
-          <w:rFonts w:ascii="Calibri" w:eastAsia="Spectral" w:hAnsi="Calibri" w:cs="Calibri"/>
-          <w:i/>
-          <w:iCs/>
-          <w:sz w:val="20"/>
-          <w:szCs w:val="20"/>
-          <w:lang w:val="en-US"/>
-        </w:rPr>
-        <w:t>6</w:t>
-      </w:r>
-      <w:r>
-        <w:rPr>
-          <w:rFonts w:ascii="Calibri" w:eastAsia="Spectral" w:hAnsi="Calibri" w:cs="Calibri"/>
-          <w:i/>
-          <w:iCs/>
-          <w:sz w:val="20"/>
-          <w:szCs w:val="20"/>
-          <w:lang w:val="en-US"/>
-        </w:rPr>
-        <w:t>-</w:t>
-      </w:r>
-      <w:r>
-        <w:rPr>
-          <w:rFonts w:ascii="Calibri" w:eastAsia="Spectral" w:hAnsi="Calibri" w:cs="Calibri"/>
-          <w:i/>
-          <w:iCs/>
-          <w:sz w:val="20"/>
-          <w:szCs w:val="20"/>
-          <w:lang w:val="en-US"/>
-        </w:rPr>
-        <w:t>August 2026</w:t>
-      </w:r>
-    </w:p>
-    <w:p>
-      <w:pPr>
         <w:pStyle w:val="ListParagraph"/>
         <w:numPr>
           <w:ilvl w:val="0"/>
@@ -1454,7 +1130,261 @@
           <w:sz w:val="20"/>
           <w:szCs w:val="20"/>
         </w:rPr>
-        <w:t>Designed and built a 6-DOF robotic arm to explore intuitive human-machine control, translating Meta Quest 3 VR movements into real-time robotic motion</w:t>
+        <w:t>Collaborat</w:t>
+      </w:r>
+      <w:r>
+        <w:rPr>
+          <w:rFonts w:ascii="Calibri" w:eastAsia="Spectral" w:hAnsi="Calibri" w:cs="Calibri"/>
+          <w:bCs/>
+          <w:sz w:val="20"/>
+          <w:szCs w:val="20"/>
+        </w:rPr>
+        <w:t>ed</w:t>
+      </w:r>
+      <w:r>
+        <w:rPr>
+          <w:rFonts w:ascii="Calibri" w:eastAsia="Spectral" w:hAnsi="Calibri" w:cs="Calibri"/>
+          <w:bCs/>
+          <w:sz w:val="20"/>
+          <w:szCs w:val="20"/>
+        </w:rPr>
+        <w:t xml:space="preserve"> with the KU School of Business to </w:t>
+      </w:r>
+      <w:r>
+        <w:rPr>
+          <w:rFonts w:ascii="Calibri" w:eastAsia="Spectral" w:hAnsi="Calibri" w:cs="Calibri"/>
+          <w:bCs/>
+          <w:sz w:val="20"/>
+          <w:szCs w:val="20"/>
+        </w:rPr>
+        <w:t>scale the venture to be</w:t>
+      </w:r>
+      <w:r>
+        <w:rPr>
+          <w:rFonts w:ascii="Calibri" w:eastAsia="Spectral" w:hAnsi="Calibri" w:cs="Calibri"/>
+          <w:bCs/>
+          <w:sz w:val="20"/>
+          <w:szCs w:val="20"/>
+        </w:rPr>
+        <w:t xml:space="preserve"> successful and</w:t>
+      </w:r>
+      <w:r>
+        <w:rPr>
+          <w:rFonts w:ascii="Calibri" w:eastAsia="Spectral" w:hAnsi="Calibri" w:cs="Calibri"/>
+          <w:bCs/>
+          <w:sz w:val="20"/>
+          <w:szCs w:val="20"/>
+        </w:rPr>
+        <w:t xml:space="preserve"> profitable</w:t>
+      </w:r>
+    </w:p>
+    <w:p>
+      <w:pPr>
+        <w:pBdr>
+          <w:bottom w:val="single" w:sz="6" w:space="1" w:color="000000"/>
+        </w:pBdr>
+        <w:spacing w:line="240" w:lineRule="auto"/>
+        <w:rPr>
+          <w:rFonts w:ascii="Calibri" w:eastAsia="Spectral" w:hAnsi="Calibri" w:cs="Calibri"/>
+          <w:b/>
+          <w:smallCaps/>
+        </w:rPr>
+      </w:pPr>
+      <w:r>
+        <w:rPr>
+          <w:rFonts w:ascii="Calibri" w:eastAsia="Spectral" w:hAnsi="Calibri" w:cs="Calibri"/>
+          <w:b/>
+          <w:smallCaps/>
+        </w:rPr>
+        <w:t>PROJECTS</w:t>
+      </w:r>
+      <w:r>
+        <w:rPr>
+          <w:rFonts w:ascii="Calibri" w:eastAsia="Spectral" w:hAnsi="Calibri" w:cs="Calibri"/>
+          <w:b/>
+          <w:smallCaps/>
+        </w:rPr>
+        <w:t xml:space="preserve"> &amp; ADDITIONAL EXPERIENCE</w:t>
+      </w:r>
+    </w:p>
+    <w:p>
+      <w:pPr>
+        <w:tabs>
+          <w:tab w:val="right" w:pos="10710"/>
+        </w:tabs>
+        <w:spacing w:line="240" w:lineRule="auto"/>
+        <w:rPr>
+          <w:rFonts w:ascii="Calibri" w:eastAsia="Spectral" w:hAnsi="Calibri" w:cs="Calibri"/>
+          <w:sz w:val="20"/>
+          <w:szCs w:val="20"/>
+          <w:lang w:val="en-US"/>
+        </w:rPr>
+      </w:pPr>
+      <w:r>
+        <w:rPr>
+          <w:rFonts w:ascii="Calibri" w:eastAsia="Spectral" w:hAnsi="Calibri" w:cs="Calibri"/>
+          <w:b/>
+          <w:bCs/>
+          <w:sz w:val="20"/>
+          <w:szCs w:val="20"/>
+          <w:lang w:val="en-US"/>
+        </w:rPr>
+        <w:t>6-DOF Teleoperated Robotic Arm</w:t>
+      </w:r>
+      <w:r>
+        <w:rPr>
+          <w:rFonts w:ascii="Calibri" w:eastAsia="Spectral" w:hAnsi="Calibri" w:cs="Calibri"/>
+          <w:b/>
+          <w:bCs/>
+          <w:sz w:val="20"/>
+          <w:szCs w:val="20"/>
+          <w:lang w:val="en-US"/>
+        </w:rPr>
+        <w:t xml:space="preserve">, </w:t>
+      </w:r>
+      <w:r>
+        <w:rPr>
+          <w:rFonts w:ascii="Calibri" w:eastAsia="Spectral" w:hAnsi="Calibri" w:cs="Calibri"/>
+          <w:i/>
+          <w:iCs/>
+          <w:sz w:val="20"/>
+          <w:szCs w:val="20"/>
+          <w:lang w:val="en-US"/>
+        </w:rPr>
+        <w:t>1</w:t>
+      </w:r>
+      <w:r>
+        <w:rPr>
+          <w:rFonts w:ascii="Calibri" w:eastAsia="Spectral" w:hAnsi="Calibri" w:cs="Calibri"/>
+          <w:i/>
+          <w:iCs/>
+          <w:sz w:val="20"/>
+          <w:szCs w:val="20"/>
+          <w:vertAlign w:val="superscript"/>
+          <w:lang w:val="en-US"/>
+        </w:rPr>
+        <w:t>st</w:t>
+      </w:r>
+      <w:r>
+        <w:rPr>
+          <w:rFonts w:ascii="Calibri" w:eastAsia="Spectral" w:hAnsi="Calibri" w:cs="Calibri"/>
+          <w:i/>
+          <w:iCs/>
+          <w:sz w:val="20"/>
+          <w:szCs w:val="20"/>
+          <w:lang w:val="en-US"/>
+        </w:rPr>
+        <w:t xml:space="preserve"> Place </w:t>
+      </w:r>
+      <w:r>
+        <w:rPr>
+          <w:rFonts w:ascii="Calibri" w:eastAsia="Spectral" w:hAnsi="Calibri" w:cs="Calibri"/>
+          <w:i/>
+          <w:iCs/>
+          <w:sz w:val="20"/>
+          <w:szCs w:val="20"/>
+          <w:lang w:val="en-US"/>
+        </w:rPr>
+        <w:t>Award Winne</w:t>
+      </w:r>
+      <w:r>
+        <w:rPr>
+          <w:rFonts w:ascii="Calibri" w:eastAsia="Spectral" w:hAnsi="Calibri" w:cs="Calibri"/>
+          <w:i/>
+          <w:iCs/>
+          <w:sz w:val="20"/>
+          <w:szCs w:val="20"/>
+          <w:lang w:val="en-US"/>
+        </w:rPr>
+        <w:t xml:space="preserve">r </w:t>
+      </w:r>
+      <w:r>
+        <w:rPr>
+          <w:rFonts w:ascii="Calibri" w:eastAsia="Spectral" w:hAnsi="Calibri" w:cs="Calibri"/>
+          <w:i/>
+          <w:iCs/>
+          <w:sz w:val="20"/>
+          <w:szCs w:val="20"/>
+          <w:lang w:val="en-US"/>
+        </w:rPr>
+        <w:t>on The Hive</w:t>
+      </w:r>
+      <w:r>
+        <w:rPr>
+          <w:rFonts w:ascii="Calibri" w:eastAsia="Spectral" w:hAnsi="Calibri" w:cs="Calibri"/>
+          <w:i/>
+          <w:iCs/>
+          <w:sz w:val="20"/>
+          <w:szCs w:val="20"/>
+          <w:lang w:val="en-US"/>
+        </w:rPr>
+        <w:tab/>
+      </w:r>
+      <w:r>
+        <w:rPr>
+          <w:rFonts w:ascii="Calibri" w:eastAsia="Spectral" w:hAnsi="Calibri" w:cs="Calibri"/>
+          <w:i/>
+          <w:iCs/>
+          <w:sz w:val="20"/>
+          <w:szCs w:val="20"/>
+          <w:lang w:val="en-US"/>
+        </w:rPr>
+        <w:t>Ju</w:t>
+      </w:r>
+      <w:r>
+        <w:rPr>
+          <w:rFonts w:ascii="Calibri" w:eastAsia="Spectral" w:hAnsi="Calibri" w:cs="Calibri"/>
+          <w:i/>
+          <w:iCs/>
+          <w:sz w:val="20"/>
+          <w:szCs w:val="20"/>
+          <w:lang w:val="en-US"/>
+        </w:rPr>
+        <w:t>ne</w:t>
+      </w:r>
+      <w:r>
+        <w:rPr>
+          <w:rFonts w:ascii="Calibri" w:eastAsia="Spectral" w:hAnsi="Calibri" w:cs="Calibri"/>
+          <w:i/>
+          <w:iCs/>
+          <w:sz w:val="20"/>
+          <w:szCs w:val="20"/>
+          <w:lang w:val="en-US"/>
+        </w:rPr>
+        <w:t xml:space="preserve"> 202</w:t>
+      </w:r>
+      <w:r>
+        <w:rPr>
+          <w:rFonts w:ascii="Calibri" w:eastAsia="Spectral" w:hAnsi="Calibri" w:cs="Calibri"/>
+          <w:i/>
+          <w:iCs/>
+          <w:sz w:val="20"/>
+          <w:szCs w:val="20"/>
+          <w:lang w:val="en-US"/>
+        </w:rPr>
+        <w:t>6</w:t>
+      </w:r>
+      <w:r>
+        <w:rPr>
+          <w:rFonts w:ascii="Calibri" w:eastAsia="Spectral" w:hAnsi="Calibri" w:cs="Calibri"/>
+          <w:i/>
+          <w:iCs/>
+          <w:sz w:val="20"/>
+          <w:szCs w:val="20"/>
+          <w:lang w:val="en-US"/>
+        </w:rPr>
+        <w:t>-</w:t>
+      </w:r>
+      <w:r>
+        <w:rPr>
+          <w:rFonts w:ascii="Calibri" w:eastAsia="Spectral" w:hAnsi="Calibri" w:cs="Calibri"/>
+          <w:i/>
+          <w:iCs/>
+          <w:sz w:val="20"/>
+          <w:szCs w:val="20"/>
+          <w:lang w:val="en-US"/>
+        </w:rPr>
+        <w:t>August 2026</w:t>
       </w:r>
     </w:p>
     <w:p>
@@ -1483,7 +1413,7 @@
           <w:sz w:val="20"/>
           <w:szCs w:val="20"/>
         </w:rPr>
-        <w:t>Developed a Unity/C# control system that streams real-time joystick data over UDP to a Raspberry Pi, driving six servo motors through a PCA9685 controller</w:t>
+        <w:t>Designed and built a 6-DOF robotic arm to explore intuitive human-machine control, translating Meta Quest 3 VR movements into real-time robotic motion</w:t>
       </w:r>
     </w:p>
     <w:p>
@@ -1512,118 +1442,7 @@
           <w:sz w:val="20"/>
           <w:szCs w:val="20"/>
         </w:rPr>
-        <w:t>Implemented Unity’s built-in inverse kinematics solver to translate user input into coordinated joint movement and improve control of the robotic arm</w:t>
-      </w:r>
-    </w:p>
-    <w:p>
-      <w:pPr>
-        <w:tabs>
-          <w:tab w:val="right" w:pos="10710"/>
-        </w:tabs>
-        <w:spacing w:line="240" w:lineRule="auto"/>
-        <w:rPr>
-          <w:rFonts w:ascii="Calibri" w:eastAsia="Spectral" w:hAnsi="Calibri" w:cs="Calibri"/>
-          <w:sz w:val="20"/>
-          <w:szCs w:val="20"/>
-          <w:lang w:val="en-US"/>
-        </w:rPr>
-      </w:pPr>
-      <w:r>
-        <w:rPr>
-          <w:rFonts w:ascii="Calibri" w:eastAsia="Spectral" w:hAnsi="Calibri" w:cs="Calibri"/>
-          <w:b/>
-          <w:bCs/>
-          <w:sz w:val="20"/>
-          <w:szCs w:val="20"/>
-        </w:rPr>
-        <w:t>Omnidirectional Rolling Bot (ORB)</w:t>
-      </w:r>
-      <w:r>
-        <w:rPr>
-          <w:rFonts w:ascii="Calibri" w:eastAsia="Spectral" w:hAnsi="Calibri" w:cs="Calibri"/>
-          <w:b/>
-          <w:bCs/>
-          <w:sz w:val="20"/>
-          <w:szCs w:val="20"/>
-        </w:rPr>
-        <w:t xml:space="preserve">, </w:t>
-      </w:r>
-      <w:r>
-        <w:rPr>
-          <w:rFonts w:ascii="Calibri" w:eastAsia="Spectral" w:hAnsi="Calibri" w:cs="Calibri"/>
-          <w:i/>
-          <w:iCs/>
-          <w:sz w:val="20"/>
-          <w:szCs w:val="20"/>
-          <w:lang w:val="en-US"/>
-        </w:rPr>
-        <w:t>4</w:t>
-      </w:r>
-      <w:r>
-        <w:rPr>
-          <w:rFonts w:ascii="Calibri" w:eastAsia="Spectral" w:hAnsi="Calibri" w:cs="Calibri"/>
-          <w:i/>
-          <w:iCs/>
-          <w:sz w:val="20"/>
-          <w:szCs w:val="20"/>
-          <w:lang w:val="en-US"/>
-        </w:rPr>
-        <w:t>th</w:t>
-      </w:r>
-      <w:r>
-        <w:rPr>
-          <w:rFonts w:ascii="Calibri" w:eastAsia="Spectral" w:hAnsi="Calibri" w:cs="Calibri"/>
-          <w:i/>
-          <w:iCs/>
-          <w:sz w:val="20"/>
-          <w:szCs w:val="20"/>
-          <w:lang w:val="en-US"/>
-        </w:rPr>
-        <w:t xml:space="preserve"> Place </w:t>
-      </w:r>
-      <w:r>
-        <w:rPr>
-          <w:rFonts w:ascii="Calibri" w:eastAsia="Spectral" w:hAnsi="Calibri" w:cs="Calibri"/>
-          <w:i/>
-          <w:iCs/>
-          <w:sz w:val="20"/>
-          <w:szCs w:val="20"/>
-          <w:lang w:val="en-US"/>
-        </w:rPr>
-        <w:t>Award Winner</w:t>
-      </w:r>
-      <w:r>
-        <w:rPr>
-          <w:rFonts w:ascii="Calibri" w:eastAsia="Spectral" w:hAnsi="Calibri" w:cs="Calibri"/>
-          <w:i/>
-          <w:iCs/>
-          <w:sz w:val="20"/>
-          <w:szCs w:val="20"/>
-          <w:lang w:val="en-US"/>
-        </w:rPr>
-        <w:t xml:space="preserve"> on The Hive</w:t>
-      </w:r>
-      <w:r>
-        <w:rPr>
-          <w:rFonts w:ascii="Calibri" w:eastAsia="Spectral" w:hAnsi="Calibri" w:cs="Calibri"/>
-          <w:i/>
-          <w:iCs/>
-          <w:sz w:val="20"/>
-          <w:szCs w:val="20"/>
-          <w:lang w:val="en-US"/>
-        </w:rPr>
-        <w:tab/>
-      </w:r>
-      <w:r>
-        <w:rPr>
-          <w:rFonts w:ascii="Calibri" w:eastAsia="Spectral" w:hAnsi="Calibri" w:cs="Calibri"/>
-          <w:i/>
-          <w:iCs/>
-          <w:sz w:val="20"/>
-          <w:szCs w:val="20"/>
-          <w:lang w:val="en-US"/>
-        </w:rPr>
-        <w:t>August 2026</w:t>
+        <w:t>Developed a Unity/C# control system that streams real-time joystick data over UDP to a Raspberry Pi, driving six servo motors through a PCA9685 controller</w:t>
       </w:r>
     </w:p>
     <w:p>
@@ -1652,7 +1471,118 @@
           <w:sz w:val="20"/>
           <w:szCs w:val="20"/>
         </w:rPr>
-        <w:t>Designed and built a spherical telepresence robot capable of multidirectional movement using three omni wheels and custom Python kiwi-drive kinematics</w:t>
+        <w:t>Implemented Unity’s built-in inverse kinematics solver to translate user input into coordinated joint movement and improve control of the robotic arm</w:t>
+      </w:r>
+    </w:p>
+    <w:p>
+      <w:pPr>
+        <w:tabs>
+          <w:tab w:val="right" w:pos="10710"/>
+        </w:tabs>
+        <w:spacing w:line="240" w:lineRule="auto"/>
+        <w:rPr>
+          <w:rFonts w:ascii="Calibri" w:eastAsia="Spectral" w:hAnsi="Calibri" w:cs="Calibri"/>
+          <w:sz w:val="20"/>
+          <w:szCs w:val="20"/>
+          <w:lang w:val="en-US"/>
+        </w:rPr>
+      </w:pPr>
+      <w:r>
+        <w:rPr>
+          <w:rFonts w:ascii="Calibri" w:eastAsia="Spectral" w:hAnsi="Calibri" w:cs="Calibri"/>
+          <w:b/>
+          <w:bCs/>
+          <w:sz w:val="20"/>
+          <w:szCs w:val="20"/>
+        </w:rPr>
+        <w:t>Omnidirectional Rolling Bot (ORB)</w:t>
+      </w:r>
+      <w:r>
+        <w:rPr>
+          <w:rFonts w:ascii="Calibri" w:eastAsia="Spectral" w:hAnsi="Calibri" w:cs="Calibri"/>
+          <w:b/>
+          <w:bCs/>
+          <w:sz w:val="20"/>
+          <w:szCs w:val="20"/>
+        </w:rPr>
+        <w:t xml:space="preserve">, </w:t>
+      </w:r>
+      <w:r>
+        <w:rPr>
+          <w:rFonts w:ascii="Calibri" w:eastAsia="Spectral" w:hAnsi="Calibri" w:cs="Calibri"/>
+          <w:i/>
+          <w:iCs/>
+          <w:sz w:val="20"/>
+          <w:szCs w:val="20"/>
+          <w:lang w:val="en-US"/>
+        </w:rPr>
+        <w:t>4</w:t>
+      </w:r>
+      <w:r>
+        <w:rPr>
+          <w:rFonts w:ascii="Calibri" w:eastAsia="Spectral" w:hAnsi="Calibri" w:cs="Calibri"/>
+          <w:i/>
+          <w:iCs/>
+          <w:sz w:val="20"/>
+          <w:szCs w:val="20"/>
+          <w:lang w:val="en-US"/>
+        </w:rPr>
+        <w:t>th</w:t>
+      </w:r>
+      <w:r>
+        <w:rPr>
+          <w:rFonts w:ascii="Calibri" w:eastAsia="Spectral" w:hAnsi="Calibri" w:cs="Calibri"/>
+          <w:i/>
+          <w:iCs/>
+          <w:sz w:val="20"/>
+          <w:szCs w:val="20"/>
+          <w:lang w:val="en-US"/>
+        </w:rPr>
+        <w:t xml:space="preserve"> Place </w:t>
+      </w:r>
+      <w:r>
+        <w:rPr>
+          <w:rFonts w:ascii="Calibri" w:eastAsia="Spectral" w:hAnsi="Calibri" w:cs="Calibri"/>
+          <w:i/>
+          <w:iCs/>
+          <w:sz w:val="20"/>
+          <w:szCs w:val="20"/>
+          <w:lang w:val="en-US"/>
+        </w:rPr>
+        <w:t>Award Winner</w:t>
+      </w:r>
+      <w:r>
+        <w:rPr>
+          <w:rFonts w:ascii="Calibri" w:eastAsia="Spectral" w:hAnsi="Calibri" w:cs="Calibri"/>
+          <w:i/>
+          <w:iCs/>
+          <w:sz w:val="20"/>
+          <w:szCs w:val="20"/>
+          <w:lang w:val="en-US"/>
+        </w:rPr>
+        <w:t xml:space="preserve"> on The Hive</w:t>
+      </w:r>
+      <w:r>
+        <w:rPr>
+          <w:rFonts w:ascii="Calibri" w:eastAsia="Spectral" w:hAnsi="Calibri" w:cs="Calibri"/>
+          <w:i/>
+          <w:iCs/>
+          <w:sz w:val="20"/>
+          <w:szCs w:val="20"/>
+          <w:lang w:val="en-US"/>
+        </w:rPr>
+        <w:tab/>
+      </w:r>
+      <w:r>
+        <w:rPr>
+          <w:rFonts w:ascii="Calibri" w:eastAsia="Spectral" w:hAnsi="Calibri" w:cs="Calibri"/>
+          <w:i/>
+          <w:iCs/>
+          <w:sz w:val="20"/>
+          <w:szCs w:val="20"/>
+          <w:lang w:val="en-US"/>
+        </w:rPr>
+        <w:t>August 2026</w:t>
       </w:r>
     </w:p>
     <w:p>
@@ -1681,317 +1611,7 @@
           <w:sz w:val="20"/>
           <w:szCs w:val="20"/>
         </w:rPr>
-        <w:t>Integrated a Raspberry Pi Zero 2 W, dual motor drivers, custom 12V-to-5V power distribution, and three N20 motors into a compact mobile platform</w:t>
-      </w:r>
-    </w:p>
-    <w:p>
-      <w:pPr>
-        <w:pBdr>
-          <w:bottom w:val="single" w:sz="6" w:space="1" w:color="000000"/>
-        </w:pBdr>
-        <w:spacing w:line="240" w:lineRule="auto"/>
-        <w:rPr>
-          <w:rFonts w:ascii="Calibri" w:eastAsia="Spectral" w:hAnsi="Calibri" w:cs="Calibri"/>
-          <w:b/>
-          <w:smallCaps/>
-        </w:rPr>
-      </w:pPr>
-      <w:r>
-        <w:rPr>
-          <w:rFonts w:ascii="Calibri" w:eastAsia="Spectral" w:hAnsi="Calibri" w:cs="Calibri"/>
-          <w:b/>
-          <w:smallCaps/>
-        </w:rPr>
-        <w:t>LEADERSHIP</w:t>
-      </w:r>
-    </w:p>
-    <w:p>
-      <w:pPr>
-        <w:tabs>
-          <w:tab w:val="left" w:pos="1134"/>
-          <w:tab w:val="right" w:pos="10710"/>
-          <w:tab w:val="right" w:pos="10800"/>
-        </w:tabs>
-        <w:spacing w:line="240" w:lineRule="auto"/>
-        <w:rPr>
-          <w:rFonts w:ascii="Calibri" w:eastAsia="Spectral" w:hAnsi="Calibri" w:cs="Calibri"/>
-          <w:b/>
-          <w:sz w:val="20"/>
-          <w:szCs w:val="20"/>
-        </w:rPr>
-      </w:pPr>
-      <w:r>
-        <w:rPr>
-          <w:rFonts w:ascii="Calibri" w:eastAsia="Spectral" w:hAnsi="Calibri" w:cs="Calibri"/>
-          <w:b/>
-          <w:sz w:val="20"/>
-          <w:szCs w:val="20"/>
-        </w:rPr>
-        <w:t>SELF</w:t>
-      </w:r>
-      <w:r>
-        <w:rPr>
-          <w:rFonts w:ascii="Calibri" w:eastAsia="Spectral" w:hAnsi="Calibri" w:cs="Calibri"/>
-          <w:b/>
-          <w:sz w:val="20"/>
-          <w:szCs w:val="20"/>
-        </w:rPr>
-        <w:t xml:space="preserve"> Engineering Leadership Fellow</w:t>
-      </w:r>
-      <w:r>
-        <w:rPr>
-          <w:rFonts w:ascii="Calibri" w:eastAsia="Spectral" w:hAnsi="Calibri" w:cs="Calibri"/>
-          <w:b/>
-          <w:sz w:val="20"/>
-          <w:szCs w:val="20"/>
-        </w:rPr>
-        <w:t xml:space="preserve">, </w:t>
-      </w:r>
-      <w:r>
-        <w:rPr>
-          <w:rFonts w:ascii="Calibri" w:eastAsia="Spectral" w:hAnsi="Calibri" w:cs="Calibri"/>
-          <w:bCs/>
-          <w:i/>
-          <w:iCs/>
-          <w:sz w:val="20"/>
-          <w:szCs w:val="20"/>
-        </w:rPr>
-        <w:t>Class of 2028 Fellow</w:t>
-      </w:r>
-      <w:r>
-        <w:rPr>
-          <w:rFonts w:ascii="Calibri" w:eastAsia="Spectral" w:hAnsi="Calibri" w:cs="Calibri"/>
-          <w:bCs/>
-          <w:i/>
-          <w:iCs/>
-          <w:sz w:val="20"/>
-          <w:szCs w:val="20"/>
-        </w:rPr>
-        <w:tab/>
-      </w:r>
-      <w:r>
-        <w:rPr>
-          <w:rFonts w:ascii="Calibri" w:eastAsia="Spectral" w:hAnsi="Calibri" w:cs="Calibri"/>
-          <w:bCs/>
-          <w:i/>
-          <w:iCs/>
-          <w:sz w:val="20"/>
-          <w:szCs w:val="20"/>
-        </w:rPr>
-        <w:t>March 2025-Present</w:t>
-      </w:r>
-    </w:p>
-    <w:p>
-      <w:pPr>
-        <w:pStyle w:val="ListParagraph"/>
-        <w:numPr>
-          <w:ilvl w:val="0"/>
-          <w:numId w:val="16"/>
-        </w:numPr>
-        <w:spacing w:line="240" w:lineRule="auto"/>
-        <w:ind w:left="432" w:hanging="288"/>
-        <w:rPr>
-          <w:rFonts w:ascii="Calibri" w:eastAsia="Spectral" w:hAnsi="Calibri" w:cs="Calibri"/>
-          <w:bCs/>
-          <w:sz w:val="20"/>
-          <w:szCs w:val="20"/>
-        </w:rPr>
-      </w:pPr>
-      <w:r>
-        <w:rPr>
-          <w:rFonts w:ascii="Calibri" w:eastAsia="Spectral" w:hAnsi="Calibri" w:cs="Calibri"/>
-          <w:bCs/>
-          <w:sz w:val="20"/>
-          <w:szCs w:val="20"/>
-        </w:rPr>
-        <w:t>Selected as 1 of 21 students through a highly competitive selection process for a leadership program developing high-achieving engineers for careers in innovation, entrepreneurship, and leadership.</w:t>
-      </w:r>
-    </w:p>
-    <w:p>
-      <w:pPr>
-        <w:pStyle w:val="ListParagraph"/>
-        <w:numPr>
-          <w:ilvl w:val="0"/>
-          <w:numId w:val="16"/>
-        </w:numPr>
-        <w:spacing w:line="240" w:lineRule="auto"/>
-        <w:ind w:left="432" w:hanging="288"/>
-        <w:rPr>
-          <w:rFonts w:ascii="Calibri" w:eastAsia="Spectral" w:hAnsi="Calibri" w:cs="Calibri"/>
-          <w:bCs/>
-          <w:sz w:val="20"/>
-          <w:szCs w:val="20"/>
-        </w:rPr>
-      </w:pPr>
-      <w:r>
-        <w:rPr>
-          <w:rFonts w:ascii="Calibri" w:eastAsia="Spectral" w:hAnsi="Calibri" w:cs="Calibri"/>
-          <w:bCs/>
-          <w:sz w:val="20"/>
-          <w:szCs w:val="20"/>
-        </w:rPr>
-        <w:t xml:space="preserve">Mechanical </w:t>
-      </w:r>
-      <w:r>
-        <w:rPr>
-          <w:rFonts w:ascii="Calibri" w:eastAsia="Spectral" w:hAnsi="Calibri" w:cs="Calibri"/>
-          <w:bCs/>
-          <w:sz w:val="20"/>
-          <w:szCs w:val="20"/>
-        </w:rPr>
-        <w:t>C</w:t>
-      </w:r>
-      <w:r>
-        <w:rPr>
-          <w:rFonts w:ascii="Calibri" w:eastAsia="Spectral" w:hAnsi="Calibri" w:cs="Calibri"/>
-          <w:bCs/>
-          <w:sz w:val="20"/>
-          <w:szCs w:val="20"/>
-        </w:rPr>
-        <w:t xml:space="preserve">ompetition </w:t>
-      </w:r>
-      <w:r>
-        <w:rPr>
-          <w:rFonts w:ascii="Calibri" w:eastAsia="Spectral" w:hAnsi="Calibri" w:cs="Calibri"/>
-          <w:bCs/>
-          <w:sz w:val="20"/>
-          <w:szCs w:val="20"/>
-        </w:rPr>
-        <w:t>L</w:t>
-      </w:r>
-      <w:r>
-        <w:rPr>
-          <w:rFonts w:ascii="Calibri" w:eastAsia="Spectral" w:hAnsi="Calibri" w:cs="Calibri"/>
-          <w:bCs/>
-          <w:sz w:val="20"/>
-          <w:szCs w:val="20"/>
-        </w:rPr>
-        <w:t>ead for the School of Engineering High School Design competition</w:t>
-      </w:r>
-      <w:r>
-        <w:rPr>
-          <w:rFonts w:ascii="Calibri" w:eastAsia="Spectral" w:hAnsi="Calibri" w:cs="Calibri"/>
-          <w:bCs/>
-          <w:sz w:val="20"/>
-          <w:szCs w:val="20"/>
-        </w:rPr>
-        <w:t xml:space="preserve"> where</w:t>
-      </w:r>
-      <w:r>
-        <w:rPr>
-          <w:rFonts w:ascii="Calibri" w:eastAsia="Spectral" w:hAnsi="Calibri" w:cs="Calibri"/>
-          <w:bCs/>
-          <w:sz w:val="20"/>
-          <w:szCs w:val="20"/>
-        </w:rPr>
-        <w:t xml:space="preserve"> over 400 students</w:t>
-      </w:r>
-      <w:r>
-        <w:rPr>
-          <w:rFonts w:ascii="Calibri" w:eastAsia="Spectral" w:hAnsi="Calibri" w:cs="Calibri"/>
-          <w:bCs/>
-          <w:sz w:val="20"/>
-          <w:szCs w:val="20"/>
-        </w:rPr>
-        <w:t xml:space="preserve"> </w:t>
-      </w:r>
-      <w:r>
-        <w:rPr>
-          <w:rFonts w:ascii="Calibri" w:eastAsia="Spectral" w:hAnsi="Calibri" w:cs="Calibri"/>
-          <w:bCs/>
-          <w:sz w:val="20"/>
-          <w:szCs w:val="20"/>
-        </w:rPr>
-        <w:t>compete</w:t>
-      </w:r>
-    </w:p>
-    <w:p>
-      <w:pPr>
-        <w:tabs>
-          <w:tab w:val="left" w:pos="1134"/>
-          <w:tab w:val="right" w:pos="10503"/>
-        </w:tabs>
-        <w:spacing w:line="240" w:lineRule="auto"/>
-        <w:rPr>
-          <w:rFonts w:ascii="Calibri" w:eastAsia="Spectral" w:hAnsi="Calibri" w:cs="Calibri"/>
-          <w:bCs/>
-          <w:i/>
-          <w:iCs/>
-          <w:sz w:val="20"/>
-          <w:szCs w:val="20"/>
-        </w:rPr>
-      </w:pPr>
-      <w:r>
-        <w:rPr>
-          <w:rFonts w:ascii="Calibri" w:eastAsia="Spectral" w:hAnsi="Calibri" w:cs="Calibri"/>
-          <w:b/>
-          <w:sz w:val="20"/>
-          <w:szCs w:val="20"/>
-        </w:rPr>
-        <w:t xml:space="preserve">University of Kansas Pickleball </w:t>
-      </w:r>
-      <w:r>
-        <w:rPr>
-          <w:rFonts w:ascii="Calibri" w:eastAsia="Spectral" w:hAnsi="Calibri" w:cs="Calibri"/>
-          <w:b/>
-          <w:sz w:val="20"/>
-          <w:szCs w:val="20"/>
-        </w:rPr>
-        <w:t>Tea</w:t>
-      </w:r>
-      <w:r>
-        <w:rPr>
-          <w:rFonts w:ascii="Calibri" w:eastAsia="Spectral" w:hAnsi="Calibri" w:cs="Calibri"/>
-          <w:b/>
-          <w:sz w:val="20"/>
-          <w:szCs w:val="20"/>
-        </w:rPr>
-        <w:t xml:space="preserve">m (D1 Affiliated), </w:t>
-      </w:r>
-      <w:r>
-        <w:rPr>
-          <w:rFonts w:ascii="Calibri" w:eastAsia="Spectral" w:hAnsi="Calibri" w:cs="Calibri"/>
-          <w:bCs/>
-          <w:i/>
-          <w:iCs/>
-          <w:sz w:val="20"/>
-          <w:szCs w:val="20"/>
-        </w:rPr>
-        <w:t xml:space="preserve">Vice President </w:t>
-      </w:r>
-      <w:r>
-        <w:rPr>
-          <w:rFonts w:ascii="Calibri" w:eastAsia="Spectral" w:hAnsi="Calibri" w:cs="Calibri"/>
-          <w:bCs/>
-          <w:i/>
-          <w:iCs/>
-          <w:sz w:val="20"/>
-          <w:szCs w:val="20"/>
-        </w:rPr>
-        <w:t xml:space="preserve">   </w:t>
-      </w:r>
-      <w:r>
-        <w:rPr>
-          <w:rFonts w:ascii="Calibri" w:eastAsia="Spectral" w:hAnsi="Calibri" w:cs="Calibri"/>
-          <w:bCs/>
-          <w:i/>
-          <w:iCs/>
-          <w:sz w:val="20"/>
-          <w:szCs w:val="20"/>
-        </w:rPr>
-        <w:tab/>
-        <w:t xml:space="preserve"> </w:t>
-      </w:r>
-      <w:r>
-        <w:rPr>
-          <w:rFonts w:ascii="Calibri" w:eastAsia="Spectral" w:hAnsi="Calibri" w:cs="Calibri"/>
-          <w:bCs/>
-          <w:i/>
-          <w:iCs/>
-          <w:sz w:val="20"/>
-          <w:szCs w:val="20"/>
-        </w:rPr>
-        <w:t>August 2024-Present</w:t>
+        <w:t>Designed and built a spherical telepresence robot capable of multidirectional movement using three omni wheels and custom Python kiwi-drive kinematics</w:t>
       </w:r>
     </w:p>
     <w:p>
@@ -2020,7 +1640,7 @@
           <w:sz w:val="20"/>
           <w:szCs w:val="20"/>
         </w:rPr>
-        <w:t>Compete nationally against other universities in pickleball tournaments</w:t>
+        <w:t>Integrated a Raspberry Pi Zero 2 W, dual motor drivers, custom 12V-to-5V power distribution, and three N20 motors into a compact mobile platform</w:t>
       </w:r>
     </w:p>
     <w:p>
@@ -2041,11 +1661,16 @@
           <w:b/>
           <w:smallCaps/>
         </w:rPr>
-        <w:t>SKILLS</w:t>
+        <w:t>LEADERSHIP</w:t>
       </w:r>
     </w:p>
     <w:p>
       <w:pPr>
+        <w:tabs>
+          <w:tab w:val="left" w:pos="1134"/>
+          <w:tab w:val="right" w:pos="10710"/>
+          <w:tab w:val="right" w:pos="10800"/>
+        </w:tabs>
         <w:spacing w:line="240" w:lineRule="auto"/>
         <w:rPr>
           <w:rFonts w:ascii="Calibri" w:eastAsia="Spectral" w:hAnsi="Calibri" w:cs="Calibri"/>
@@ -2061,68 +1686,325 @@
           <w:sz w:val="20"/>
           <w:szCs w:val="20"/>
         </w:rPr>
-        <w:t>Technical</w:t>
-      </w:r>
-      <w:r>
-        <w:rPr>
-          <w:rFonts w:ascii="Calibri" w:eastAsia="Spectral" w:hAnsi="Calibri" w:cs="Calibri"/>
-          <w:b/>
-          <w:sz w:val="20"/>
-          <w:szCs w:val="20"/>
-        </w:rPr>
-        <w:t xml:space="preserve"> - </w:t>
-      </w:r>
-      <w:r>
-        <w:rPr>
-          <w:rFonts w:ascii="Calibri" w:eastAsia="Spectral" w:hAnsi="Calibri" w:cs="Calibri"/>
-          <w:bCs/>
-          <w:sz w:val="20"/>
-          <w:szCs w:val="20"/>
-        </w:rPr>
-        <w:t>Jira, Python, C++, C, Git, YAML, Embedded Systems, Microsoft Excel and PowerPoint</w:t>
+        <w:t>SELF</w:t>
+      </w:r>
+      <w:r>
+        <w:rPr>
+          <w:rFonts w:ascii="Calibri" w:eastAsia="Spectral" w:hAnsi="Calibri" w:cs="Calibri"/>
+          <w:b/>
+          <w:sz w:val="20"/>
+          <w:szCs w:val="20"/>
+        </w:rPr>
+        <w:t xml:space="preserve"> Engineering Leadership Fellow</w:t>
+      </w:r>
+      <w:r>
+        <w:rPr>
+          <w:rFonts w:ascii="Calibri" w:eastAsia="Spectral" w:hAnsi="Calibri" w:cs="Calibri"/>
+          <w:b/>
+          <w:sz w:val="20"/>
+          <w:szCs w:val="20"/>
+        </w:rPr>
+        <w:t xml:space="preserve">, </w:t>
+      </w:r>
+      <w:r>
+        <w:rPr>
+          <w:rFonts w:ascii="Calibri" w:eastAsia="Spectral" w:hAnsi="Calibri" w:cs="Calibri"/>
+          <w:bCs/>
+          <w:i/>
+          <w:iCs/>
+          <w:sz w:val="20"/>
+          <w:szCs w:val="20"/>
+        </w:rPr>
+        <w:t>Class of 2028 Fellow</w:t>
+      </w:r>
+      <w:r>
+        <w:rPr>
+          <w:rFonts w:ascii="Calibri" w:eastAsia="Spectral" w:hAnsi="Calibri" w:cs="Calibri"/>
+          <w:bCs/>
+          <w:i/>
+          <w:iCs/>
+          <w:sz w:val="20"/>
+          <w:szCs w:val="20"/>
+        </w:rPr>
+        <w:tab/>
+      </w:r>
+      <w:r>
+        <w:rPr>
+          <w:rFonts w:ascii="Calibri" w:eastAsia="Spectral" w:hAnsi="Calibri" w:cs="Calibri"/>
+          <w:bCs/>
+          <w:i/>
+          <w:iCs/>
+          <w:sz w:val="20"/>
+          <w:szCs w:val="20"/>
+        </w:rPr>
+        <w:t>March 2025-Present</w:t>
       </w:r>
     </w:p>
     <w:p>
       <w:pPr>
+        <w:pStyle w:val="ListParagraph"/>
+        <w:numPr>
+          <w:ilvl w:val="0"/>
+          <w:numId w:val="16"/>
+        </w:numPr>
         <w:spacing w:line="240" w:lineRule="auto"/>
-        <w:rPr>
-          <w:rFonts w:ascii="Calibri" w:eastAsia="Spectral" w:hAnsi="Calibri" w:cs="Calibri"/>
-          <w:b/>
-          <w:sz w:val="20"/>
-          <w:szCs w:val="20"/>
-        </w:rPr>
-      </w:pPr>
-      <w:r>
-        <w:rPr>
-          <w:rFonts w:ascii="Calibri" w:eastAsia="Spectral" w:hAnsi="Calibri" w:cs="Calibri"/>
-          <w:b/>
-          <w:sz w:val="20"/>
-          <w:szCs w:val="20"/>
-        </w:rPr>
-        <w:t>Professional</w:t>
-      </w:r>
-      <w:r>
-        <w:rPr>
-          <w:rFonts w:ascii="Calibri" w:eastAsia="Spectral" w:hAnsi="Calibri" w:cs="Calibri"/>
-          <w:b/>
-          <w:sz w:val="20"/>
-          <w:szCs w:val="20"/>
-        </w:rPr>
-        <w:t xml:space="preserve"> - </w:t>
-      </w:r>
-      <w:r>
-        <w:rPr>
-          <w:rFonts w:ascii="Calibri" w:eastAsia="Spectral" w:hAnsi="Calibri" w:cs="Calibri"/>
-          <w:bCs/>
-          <w:sz w:val="20"/>
-          <w:szCs w:val="20"/>
-        </w:rPr>
-        <w:t>Business Development, Project Management, Requirements Analysis, Public Speaking, Team Collaboration</w:t>
+        <w:ind w:left="432" w:hanging="288"/>
+        <w:rPr>
+          <w:rFonts w:ascii="Calibri" w:eastAsia="Spectral" w:hAnsi="Calibri" w:cs="Calibri"/>
+          <w:bCs/>
+          <w:sz w:val="20"/>
+          <w:szCs w:val="20"/>
+        </w:rPr>
+      </w:pPr>
+      <w:r>
+        <w:rPr>
+          <w:rFonts w:ascii="Calibri" w:eastAsia="Spectral" w:hAnsi="Calibri" w:cs="Calibri"/>
+          <w:bCs/>
+          <w:sz w:val="20"/>
+          <w:szCs w:val="20"/>
+        </w:rPr>
+        <w:t>Selected as 1 of 21 students through a highly competitive selection process for a leadership program developing high-achieving engineers for careers in innovation, entrepreneurship, and leadership.</w:t>
+      </w:r>
+    </w:p>
+    <w:p>
+      <w:pPr>
+        <w:pStyle w:val="ListParagraph"/>
+        <w:numPr>
+          <w:ilvl w:val="0"/>
+          <w:numId w:val="16"/>
+        </w:numPr>
+        <w:spacing w:line="240" w:lineRule="auto"/>
+        <w:ind w:left="432" w:hanging="288"/>
+        <w:rPr>
+          <w:rFonts w:ascii="Calibri" w:eastAsia="Spectral" w:hAnsi="Calibri" w:cs="Calibri"/>
+          <w:bCs/>
+          <w:sz w:val="20"/>
+          <w:szCs w:val="20"/>
+        </w:rPr>
+      </w:pPr>
+      <w:r>
+        <w:rPr>
+          <w:rFonts w:ascii="Calibri" w:eastAsia="Spectral" w:hAnsi="Calibri" w:cs="Calibri"/>
+          <w:bCs/>
+          <w:sz w:val="20"/>
+          <w:szCs w:val="20"/>
+        </w:rPr>
+        <w:t>Led a 7-person team as the Mechanical Engineering High School Design Lead, where we ran a successful competition for over 200 high schoolers.</w:t>
+      </w:r>
+    </w:p>
+    <w:p>
+      <w:pPr>
+        <w:tabs>
+          <w:tab w:val="left" w:pos="1134"/>
+          <w:tab w:val="right" w:pos="10503"/>
+        </w:tabs>
+        <w:spacing w:line="240" w:lineRule="auto"/>
+        <w:rPr>
+          <w:rFonts w:ascii="Calibri" w:eastAsia="Spectral" w:hAnsi="Calibri" w:cs="Calibri"/>
+          <w:bCs/>
+          <w:i/>
+          <w:iCs/>
+          <w:sz w:val="20"/>
+          <w:szCs w:val="20"/>
+        </w:rPr>
+      </w:pPr>
+      <w:r>
+        <w:rPr>
+          <w:rFonts w:ascii="Calibri" w:eastAsia="Spectral" w:hAnsi="Calibri" w:cs="Calibri"/>
+          <w:b/>
+          <w:sz w:val="20"/>
+          <w:szCs w:val="20"/>
+        </w:rPr>
+        <w:t xml:space="preserve">University of Kansas Pickleball </w:t>
+      </w:r>
+      <w:r>
+        <w:rPr>
+          <w:rFonts w:ascii="Calibri" w:eastAsia="Spectral" w:hAnsi="Calibri" w:cs="Calibri"/>
+          <w:b/>
+          <w:sz w:val="20"/>
+          <w:szCs w:val="20"/>
+        </w:rPr>
+        <w:t>Tea</w:t>
+      </w:r>
+      <w:r>
+        <w:rPr>
+          <w:rFonts w:ascii="Calibri" w:eastAsia="Spectral" w:hAnsi="Calibri" w:cs="Calibri"/>
+          <w:b/>
+          <w:sz w:val="20"/>
+          <w:szCs w:val="20"/>
+        </w:rPr>
+        <w:t xml:space="preserve">m (D1 Affiliated), </w:t>
+      </w:r>
+      <w:r>
+        <w:rPr>
+          <w:rFonts w:ascii="Calibri" w:eastAsia="Spectral" w:hAnsi="Calibri" w:cs="Calibri"/>
+          <w:bCs/>
+          <w:i/>
+          <w:iCs/>
+          <w:sz w:val="20"/>
+          <w:szCs w:val="20"/>
+        </w:rPr>
+        <w:t xml:space="preserve">Vice President </w:t>
+      </w:r>
+      <w:r>
+        <w:rPr>
+          <w:rFonts w:ascii="Calibri" w:eastAsia="Spectral" w:hAnsi="Calibri" w:cs="Calibri"/>
+          <w:bCs/>
+          <w:i/>
+          <w:iCs/>
+          <w:sz w:val="20"/>
+          <w:szCs w:val="20"/>
+        </w:rPr>
+        <w:t xml:space="preserve">   </w:t>
+      </w:r>
+      <w:r>
+        <w:rPr>
+          <w:rFonts w:ascii="Calibri" w:eastAsia="Spectral" w:hAnsi="Calibri" w:cs="Calibri"/>
+          <w:bCs/>
+          <w:i/>
+          <w:iCs/>
+          <w:sz w:val="20"/>
+          <w:szCs w:val="20"/>
+        </w:rPr>
+        <w:tab/>
+        <w:t xml:space="preserve"> </w:t>
+      </w:r>
+      <w:r>
+        <w:rPr>
+          <w:rFonts w:ascii="Calibri" w:eastAsia="Spectral" w:hAnsi="Calibri" w:cs="Calibri"/>
+          <w:bCs/>
+          <w:i/>
+          <w:iCs/>
+          <w:sz w:val="20"/>
+          <w:szCs w:val="20"/>
+        </w:rPr>
+        <w:t>August 2024-Present</w:t>
+      </w:r>
+    </w:p>
+    <w:p>
+      <w:pPr>
+        <w:pStyle w:val="ListParagraph"/>
+        <w:numPr>
+          <w:ilvl w:val="0"/>
+          <w:numId w:val="16"/>
+        </w:numPr>
+        <w:tabs>
+          <w:tab w:val="right" w:pos="8730"/>
+        </w:tabs>
+        <w:spacing w:line="240" w:lineRule="auto"/>
+        <w:ind w:left="432" w:hanging="288"/>
+        <w:rPr>
+          <w:rFonts w:ascii="Calibri" w:eastAsia="Spectral" w:hAnsi="Calibri" w:cs="Calibri"/>
+          <w:bCs/>
+          <w:sz w:val="20"/>
+          <w:szCs w:val="20"/>
+        </w:rPr>
+      </w:pPr>
+      <w:r>
+        <w:rPr>
+          <w:rFonts w:ascii="Calibri" w:eastAsia="Spectral" w:hAnsi="Calibri" w:cs="Calibri"/>
+          <w:bCs/>
+          <w:sz w:val="20"/>
+          <w:szCs w:val="20"/>
+        </w:rPr>
+        <w:t>Compete nationally against other universities in pickleball tournaments</w:t>
+      </w:r>
+    </w:p>
+    <w:p>
+      <w:pPr>
+        <w:tabs>
+          <w:tab w:val="right" w:pos="8730"/>
+        </w:tabs>
+        <w:spacing w:line="240" w:lineRule="auto"/>
+        <w:rPr>
+          <w:rFonts w:ascii="Calibri" w:eastAsia="Spectral" w:hAnsi="Calibri" w:cs="Calibri"/>
+          <w:bCs/>
+          <w:i/>
+          <w:iCs/>
+          <w:sz w:val="20"/>
+          <w:szCs w:val="20"/>
+        </w:rPr>
+      </w:pPr>
+      <w:r>
+        <w:rPr>
+          <w:rFonts w:ascii="Calibri" w:eastAsia="Spectral" w:hAnsi="Calibri" w:cs="Calibri"/>
+          <w:b/>
+          <w:sz w:val="20"/>
+          <w:szCs w:val="20"/>
+        </w:rPr>
+        <w:t xml:space="preserve">University of Kansas </w:t>
+      </w:r>
+      <w:r>
+        <w:rPr>
+          <w:rFonts w:ascii="Calibri" w:eastAsia="Spectral" w:hAnsi="Calibri" w:cs="Calibri"/>
+          <w:b/>
+          <w:sz w:val="20"/>
+          <w:szCs w:val="20"/>
+        </w:rPr>
+        <w:t xml:space="preserve">Consulting Club, </w:t>
+      </w:r>
+      <w:r>
+        <w:rPr>
+          <w:rFonts w:ascii="Calibri" w:eastAsia="Spectral" w:hAnsi="Calibri" w:cs="Calibri"/>
+          <w:bCs/>
+          <w:i/>
+          <w:iCs/>
+          <w:sz w:val="20"/>
+          <w:szCs w:val="20"/>
+        </w:rPr>
+        <w:t>member</w:t>
+      </w:r>
+    </w:p>
+    <w:p>
+      <w:pPr>
+        <w:pStyle w:val="ListParagraph"/>
+        <w:numPr>
+          <w:ilvl w:val="0"/>
+          <w:numId w:val="16"/>
+        </w:numPr>
+        <w:tabs>
+          <w:tab w:val="right" w:pos="8730"/>
+        </w:tabs>
+        <w:spacing w:line="240" w:lineRule="auto"/>
+        <w:ind w:left="432" w:hanging="288"/>
+        <w:rPr>
+          <w:rFonts w:ascii="Calibri" w:eastAsia="Spectral" w:hAnsi="Calibri" w:cs="Calibri"/>
+          <w:bCs/>
+          <w:sz w:val="20"/>
+          <w:szCs w:val="20"/>
+        </w:rPr>
+      </w:pPr>
+      <w:r>
+        <w:rPr>
+          <w:rFonts w:ascii="Calibri" w:eastAsia="Spectral" w:hAnsi="Calibri" w:cs="Calibri"/>
+          <w:bCs/>
+          <w:sz w:val="20"/>
+          <w:szCs w:val="20"/>
+        </w:rPr>
+        <w:t xml:space="preserve">Engage in bi-weekly consulting club meetings to explore </w:t>
+      </w:r>
+      <w:r>
+        <w:rPr>
+          <w:rFonts w:ascii="Calibri" w:eastAsia="Spectral" w:hAnsi="Calibri" w:cs="Calibri"/>
+          <w:bCs/>
+          <w:sz w:val="20"/>
+          <w:szCs w:val="20"/>
+        </w:rPr>
+        <w:t>consulting</w:t>
+      </w:r>
+      <w:r>
+        <w:rPr>
+          <w:rFonts w:ascii="Calibri" w:eastAsia="Spectral" w:hAnsi="Calibri" w:cs="Calibri"/>
+          <w:bCs/>
+          <w:sz w:val="20"/>
+          <w:szCs w:val="20"/>
+        </w:rPr>
+        <w:t>, strengthen business knowledge, and learn how consulting firms approach client problems</w:t>
       </w:r>
     </w:p>
     <w:sectPr>
       <w:pgSz w:w="12240" w:h="15840"/>
-      <w:pgMar w:top="432" w:right="720" w:bottom="720" w:left="720" w:header="720" w:footer="720" w:gutter="0"/>
+      <w:pgMar w:top="547" w:right="418" w:bottom="418" w:left="547" w:header="720" w:footer="720" w:gutter="0"/>
       <w:cols w:space="720"/>
     </w:sectPr>
   </w:body>
@@ -2367,6 +2249,118 @@
     </w:lvl>
   </w:abstractNum>
   <w:abstractNum w:abstractNumId="2" w15:restartNumberingAfterBreak="0">
+    <w:nsid w:val="18F4009B"/>
+    <w:multiLevelType w:val="hybridMultilevel"/>
+    <w:tmpl w:val="2B40929E"/>
+    <w:lvl w:ilvl="0" w:tplc="7178ACB4">
+      <w:numFmt w:val="bullet"/>
+      <w:lvlText w:val="-"/>
+      <w:lvlJc w:val="left"/>
+      <w:pPr>
+        <w:ind w:left="720" w:hanging="360"/>
+      </w:pPr>
+      <w:rPr>
+        <w:rFonts w:ascii="Calibri" w:eastAsia="Spectral" w:hAnsi="Calibri" w:cs="Calibri" w:hint="default"/>
+      </w:rPr>
+    </w:lvl>
+    <w:lvl w:ilvl="1" w:tplc="04090003" w:tentative="1">
+      <w:start w:val="1"/>
+      <w:numFmt w:val="bullet"/>
+      <w:lvlText w:val="o"/>
+      <w:lvlJc w:val="left"/>
+      <w:pPr>
+        <w:ind w:left="1440" w:hanging="360"/>
+      </w:pPr>
+      <w:rPr>
+        <w:rFonts w:ascii="Courier New" w:hAnsi="Courier New" w:cs="Courier New" w:hint="default"/>
+      </w:rPr>
+    </w:lvl>
+    <w:lvl w:ilvl="2" w:tplc="04090005" w:tentative="1">
+      <w:start w:val="1"/>
+      <w:numFmt w:val="bullet"/>
+      <w:lvlText w:val=""/>
+      <w:lvlJc w:val="left"/>
+      <w:pPr>
+        <w:ind w:left="2160" w:hanging="360"/>
+      </w:pPr>
+      <w:rPr>
+        <w:rFonts w:ascii="Wingdings" w:hAnsi="Wingdings" w:hint="default"/>
+      </w:rPr>
+    </w:lvl>
+    <w:lvl w:ilvl="3" w:tplc="04090001" w:tentative="1">
+      <w:start w:val="1"/>
+      <w:numFmt w:val="bullet"/>
+      <w:lvlText w:val=""/>
+      <w:lvlJc w:val="left"/>
+      <w:pPr>
+        <w:ind w:left="2880" w:hanging="360"/>
+      </w:pPr>
+      <w:rPr>
+        <w:rFonts w:ascii="Symbol" w:hAnsi="Symbol" w:hint="default"/>
+      </w:rPr>
+    </w:lvl>
+    <w:lvl w:ilvl="4" w:tplc="04090003" w:tentative="1">
+      <w:start w:val="1"/>
+      <w:numFmt w:val="bullet"/>
+      <w:lvlText w:val="o"/>
+      <w:lvlJc w:val="left"/>
+      <w:pPr>
+        <w:ind w:left="3600" w:hanging="360"/>
+      </w:pPr>
+      <w:rPr>
+        <w:rFonts w:ascii="Courier New" w:hAnsi="Courier New" w:cs="Courier New" w:hint="default"/>
+      </w:rPr>
+    </w:lvl>
+    <w:lvl w:ilvl="5" w:tplc="04090005" w:tentative="1">
+      <w:start w:val="1"/>
+      <w:numFmt w:val="bullet"/>
+      <w:lvlText w:val=""/>
+      <w:lvlJc w:val="left"/>
+      <w:pPr>
+        <w:ind w:left="4320" w:hanging="360"/>
+      </w:pPr>
+      <w:rPr>
+        <w:rFonts w:ascii="Wingdings" w:hAnsi="Wingdings" w:hint="default"/>
+      </w:rPr>
+    </w:lvl>
+    <w:lvl w:ilvl="6" w:tplc="04090001" w:tentative="1">
+      <w:start w:val="1"/>
+      <w:numFmt w:val="bullet"/>
+      <w:lvlText w:val=""/>
+      <w:lvlJc w:val="left"/>
+      <w:pPr>
+        <w:ind w:left="5040" w:hanging="360"/>
+      </w:pPr>
+      <w:rPr>
+        <w:rFonts w:ascii="Symbol" w:hAnsi="Symbol" w:hint="default"/>
+      </w:rPr>
+    </w:lvl>
+    <w:lvl w:ilvl="7" w:tplc="04090003" w:tentative="1">
+      <w:start w:val="1"/>
+      <w:numFmt w:val="bullet"/>
+      <w:lvlText w:val="o"/>
+      <w:lvlJc w:val="left"/>
+      <w:pPr>
+        <w:ind w:left="5760" w:hanging="360"/>
+      </w:pPr>
+      <w:rPr>
+        <w:rFonts w:ascii="Courier New" w:hAnsi="Courier New" w:cs="Courier New" w:hint="default"/>
+      </w:rPr>
+    </w:lvl>
+    <w:lvl w:ilvl="8" w:tplc="04090005" w:tentative="1">
+      <w:start w:val="1"/>
+      <w:numFmt w:val="bullet"/>
+      <w:lvlText w:val=""/>
+      <w:lvlJc w:val="left"/>
+      <w:pPr>
+        <w:ind w:left="6480" w:hanging="360"/>
+      </w:pPr>
+      <w:rPr>
+        <w:rFonts w:ascii="Wingdings" w:hAnsi="Wingdings" w:hint="default"/>
+      </w:rPr>
+    </w:lvl>
+  </w:abstractNum>
+  <w:abstractNum w:abstractNumId="3" w15:restartNumberingAfterBreak="0">
     <w:nsid w:val="19307D08"/>
     <w:multiLevelType w:val="hybridMultilevel"/>
     <w:tmpl w:val="147A1190"/>
@@ -2479,7 +2473,7 @@
       </w:rPr>
     </w:lvl>
   </w:abstractNum>
-  <w:abstractNum w:abstractNumId="3" w15:restartNumberingAfterBreak="0">
+  <w:abstractNum w:abstractNumId="4" w15:restartNumberingAfterBreak="0">
     <w:nsid w:val="1A445ABA"/>
     <w:multiLevelType w:val="hybridMultilevel"/>
     <w:tmpl w:val="3F0861F0"/>
@@ -2592,7 +2586,7 @@
       </w:rPr>
     </w:lvl>
   </w:abstractNum>
-  <w:abstractNum w:abstractNumId="4" w15:restartNumberingAfterBreak="0">
+  <w:abstractNum w:abstractNumId="5" w15:restartNumberingAfterBreak="0">
     <w:nsid w:val="1AEC10B7"/>
     <w:multiLevelType w:val="hybridMultilevel"/>
     <w:tmpl w:val="B63CCB72"/>
@@ -2705,7 +2699,120 @@
       </w:rPr>
     </w:lvl>
   </w:abstractNum>
-  <w:abstractNum w:abstractNumId="5" w15:restartNumberingAfterBreak="0">
+  <w:abstractNum w:abstractNumId="6" w15:restartNumberingAfterBreak="0">
+    <w:nsid w:val="1F47293C"/>
+    <w:multiLevelType w:val="hybridMultilevel"/>
+    <w:tmpl w:val="567423AE"/>
+    <w:lvl w:ilvl="0" w:tplc="04090001">
+      <w:start w:val="1"/>
+      <w:numFmt w:val="bullet"/>
+      <w:lvlText w:val=""/>
+      <w:lvlJc w:val="left"/>
+      <w:pPr>
+        <w:ind w:left="720" w:hanging="360"/>
+      </w:pPr>
+      <w:rPr>
+        <w:rFonts w:ascii="Symbol" w:hAnsi="Symbol" w:hint="default"/>
+      </w:rPr>
+    </w:lvl>
+    <w:lvl w:ilvl="1" w:tplc="04090003" w:tentative="1">
+      <w:start w:val="1"/>
+      <w:numFmt w:val="bullet"/>
+      <w:lvlText w:val="o"/>
+      <w:lvlJc w:val="left"/>
+      <w:pPr>
+        <w:ind w:left="1440" w:hanging="360"/>
+      </w:pPr>
+      <w:rPr>
+        <w:rFonts w:ascii="Courier New" w:hAnsi="Courier New" w:cs="Courier New" w:hint="default"/>
+      </w:rPr>
+    </w:lvl>
+    <w:lvl w:ilvl="2" w:tplc="04090005" w:tentative="1">
+      <w:start w:val="1"/>
+      <w:numFmt w:val="bullet"/>
+      <w:lvlText w:val=""/>
+      <w:lvlJc w:val="left"/>
+      <w:pPr>
+        <w:ind w:left="2160" w:hanging="360"/>
+      </w:pPr>
+      <w:rPr>
+        <w:rFonts w:ascii="Wingdings" w:hAnsi="Wingdings" w:hint="default"/>
+      </w:rPr>
+    </w:lvl>
+    <w:lvl w:ilvl="3" w:tplc="04090001" w:tentative="1">
+      <w:start w:val="1"/>
+      <w:numFmt w:val="bullet"/>
+      <w:lvlText w:val=""/>
+      <w:lvlJc w:val="left"/>
+      <w:pPr>
+        <w:ind w:left="2880" w:hanging="360"/>
+      </w:pPr>
+      <w:rPr>
+        <w:rFonts w:ascii="Symbol" w:hAnsi="Symbol" w:hint="default"/>
+      </w:rPr>
+    </w:lvl>
+    <w:lvl w:ilvl="4" w:tplc="04090003" w:tentative="1">
+      <w:start w:val="1"/>
+      <w:numFmt w:val="bullet"/>
+      <w:lvlText w:val="o"/>
+      <w:lvlJc w:val="left"/>
+      <w:pPr>
+        <w:ind w:left="3600" w:hanging="360"/>
+      </w:pPr>
+      <w:rPr>
+        <w:rFonts w:ascii="Courier New" w:hAnsi="Courier New" w:cs="Courier New" w:hint="default"/>
+      </w:rPr>
+    </w:lvl>
+    <w:lvl w:ilvl="5" w:tplc="04090005" w:tentative="1">
+      <w:start w:val="1"/>
+      <w:numFmt w:val="bullet"/>
+      <w:lvlText w:val=""/>
+      <w:lvlJc w:val="left"/>
+      <w:pPr>
+        <w:ind w:left="4320" w:hanging="360"/>
+      </w:pPr>
+      <w:rPr>
+        <w:rFonts w:ascii="Wingdings" w:hAnsi="Wingdings" w:hint="default"/>
+      </w:rPr>
+    </w:lvl>
+    <w:lvl w:ilvl="6" w:tplc="04090001" w:tentative="1">
+      <w:start w:val="1"/>
+      <w:numFmt w:val="bullet"/>
+      <w:lvlText w:val=""/>
+      <w:lvlJc w:val="left"/>
+      <w:pPr>
+        <w:ind w:left="5040" w:hanging="360"/>
+      </w:pPr>
+      <w:rPr>
+        <w:rFonts w:ascii="Symbol" w:hAnsi="Symbol" w:hint="default"/>
+      </w:rPr>
+    </w:lvl>
+    <w:lvl w:ilvl="7" w:tplc="04090003" w:tentative="1">
+      <w:start w:val="1"/>
+      <w:numFmt w:val="bullet"/>
+      <w:lvlText w:val="o"/>
+      <w:lvlJc w:val="left"/>
+      <w:pPr>
+        <w:ind w:left="5760" w:hanging="360"/>
+      </w:pPr>
+      <w:rPr>
+        <w:rFonts w:ascii="Courier New" w:hAnsi="Courier New" w:cs="Courier New" w:hint="default"/>
+      </w:rPr>
+    </w:lvl>
+    <w:lvl w:ilvl="8" w:tplc="04090005" w:tentative="1">
+      <w:start w:val="1"/>
+      <w:numFmt w:val="bullet"/>
+      <w:lvlText w:val=""/>
+      <w:lvlJc w:val="left"/>
+      <w:pPr>
+        <w:ind w:left="6480" w:hanging="360"/>
+      </w:pPr>
+      <w:rPr>
+        <w:rFonts w:ascii="Wingdings" w:hAnsi="Wingdings" w:hint="default"/>
+      </w:rPr>
+    </w:lvl>
+  </w:abstractNum>
+  <w:abstractNum w:abstractNumId="7" w15:restartNumberingAfterBreak="0">
     <w:nsid w:val="23C61833"/>
     <w:multiLevelType w:val="hybridMultilevel"/>
     <w:tmpl w:val="3B2C6526"/>
@@ -2818,7 +2925,7 @@
       </w:rPr>
     </w:lvl>
   </w:abstractNum>
-  <w:abstractNum w:abstractNumId="6" w15:restartNumberingAfterBreak="0">
+  <w:abstractNum w:abstractNumId="8" w15:restartNumberingAfterBreak="0">
     <w:nsid w:val="26153F2A"/>
     <w:multiLevelType w:val="hybridMultilevel"/>
     <w:tmpl w:val="90AA5F6E"/>
@@ -2930,7 +3037,7 @@
       </w:rPr>
     </w:lvl>
   </w:abstractNum>
-  <w:abstractNum w:abstractNumId="7" w15:restartNumberingAfterBreak="0">
+  <w:abstractNum w:abstractNumId="9" w15:restartNumberingAfterBreak="0">
     <w:nsid w:val="26C76313"/>
     <w:multiLevelType w:val="multilevel"/>
     <w:tmpl w:val="2912089C"/>
@@ -3043,7 +3150,119 @@
       </w:rPr>
     </w:lvl>
   </w:abstractNum>
-  <w:abstractNum w:abstractNumId="8" w15:restartNumberingAfterBreak="0">
+  <w:abstractNum w:abstractNumId="10" w15:restartNumberingAfterBreak="0">
+    <w:nsid w:val="334D454F"/>
+    <w:multiLevelType w:val="hybridMultilevel"/>
+    <w:tmpl w:val="77F20ED2"/>
+    <w:lvl w:ilvl="0" w:tplc="82C8935E">
+      <w:numFmt w:val="bullet"/>
+      <w:lvlText w:val="-"/>
+      <w:lvlJc w:val="left"/>
+      <w:pPr>
+        <w:ind w:left="720" w:hanging="360"/>
+      </w:pPr>
+      <w:rPr>
+        <w:rFonts w:ascii="Calibri" w:eastAsia="Spectral" w:hAnsi="Calibri" w:cs="Calibri" w:hint="default"/>
+      </w:rPr>
+    </w:lvl>
+    <w:lvl w:ilvl="1" w:tplc="04090003" w:tentative="1">
+      <w:start w:val="1"/>
+      <w:numFmt w:val="bullet"/>
+      <w:lvlText w:val="o"/>
+      <w:lvlJc w:val="left"/>
+      <w:pPr>
+        <w:ind w:left="1440" w:hanging="360"/>
+      </w:pPr>
+      <w:rPr>
+        <w:rFonts w:ascii="Courier New" w:hAnsi="Courier New" w:cs="Courier New" w:hint="default"/>
+      </w:rPr>
+    </w:lvl>
+    <w:lvl w:ilvl="2" w:tplc="04090005" w:tentative="1">
+      <w:start w:val="1"/>
+      <w:numFmt w:val="bullet"/>
+      <w:lvlText w:val=""/>
+      <w:lvlJc w:val="left"/>
+      <w:pPr>
+        <w:ind w:left="2160" w:hanging="360"/>
+      </w:pPr>
+      <w:rPr>
+        <w:rFonts w:ascii="Wingdings" w:hAnsi="Wingdings" w:hint="default"/>
+      </w:rPr>
+    </w:lvl>
+    <w:lvl w:ilvl="3" w:tplc="04090001" w:tentative="1">
+      <w:start w:val="1"/>
+      <w:numFmt w:val="bullet"/>
+      <w:lvlText w:val=""/>
+      <w:lvlJc w:val="left"/>
+      <w:pPr>
+        <w:ind w:left="2880" w:hanging="360"/>
+      </w:pPr>
+      <w:rPr>
+        <w:rFonts w:ascii="Symbol" w:hAnsi="Symbol" w:hint="default"/>
+      </w:rPr>
+    </w:lvl>
+    <w:lvl w:ilvl="4" w:tplc="04090003" w:tentative="1">
+      <w:start w:val="1"/>
+      <w:numFmt w:val="bullet"/>
+      <w:lvlText w:val="o"/>
+      <w:lvlJc w:val="left"/>
+      <w:pPr>
+        <w:ind w:left="3600" w:hanging="360"/>
+      </w:pPr>
+      <w:rPr>
+        <w:rFonts w:ascii="Courier New" w:hAnsi="Courier New" w:cs="Courier New" w:hint="default"/>
+      </w:rPr>
+    </w:lvl>
+    <w:lvl w:ilvl="5" w:tplc="04090005" w:tentative="1">
+      <w:start w:val="1"/>
+      <w:numFmt w:val="bullet"/>
+      <w:lvlText w:val=""/>
+      <w:lvlJc w:val="left"/>
+      <w:pPr>
+        <w:ind w:left="4320" w:hanging="360"/>
+      </w:pPr>
+      <w:rPr>
+        <w:rFonts w:ascii="Wingdings" w:hAnsi="Wingdings" w:hint="default"/>
+      </w:rPr>
+    </w:lvl>
+    <w:lvl w:ilvl="6" w:tplc="04090001" w:tentative="1">
+      <w:start w:val="1"/>
+      <w:numFmt w:val="bullet"/>
+      <w:lvlText w:val=""/>
+      <w:lvlJc w:val="left"/>
+      <w:pPr>
+        <w:ind w:left="5040" w:hanging="360"/>
+      </w:pPr>
+      <w:rPr>
+        <w:rFonts w:ascii="Symbol" w:hAnsi="Symbol" w:hint="default"/>
+      </w:rPr>
+    </w:lvl>
+    <w:lvl w:ilvl="7" w:tplc="04090003" w:tentative="1">
+      <w:start w:val="1"/>
+      <w:numFmt w:val="bullet"/>
+      <w:lvlText w:val="o"/>
+      <w:lvlJc w:val="left"/>
+      <w:pPr>
+        <w:ind w:left="5760" w:hanging="360"/>
+      </w:pPr>
+      <w:rPr>
+        <w:rFonts w:ascii="Courier New" w:hAnsi="Courier New" w:cs="Courier New" w:hint="default"/>
+      </w:rPr>
+    </w:lvl>
+    <w:lvl w:ilvl="8" w:tplc="04090005" w:tentative="1">
+      <w:start w:val="1"/>
+      <w:numFmt w:val="bullet"/>
+      <w:lvlText w:val=""/>
+      <w:lvlJc w:val="left"/>
+      <w:pPr>
+        <w:ind w:left="6480" w:hanging="360"/>
+      </w:pPr>
+      <w:rPr>
+        <w:rFonts w:ascii="Wingdings" w:hAnsi="Wingdings" w:hint="default"/>
+      </w:rPr>
+    </w:lvl>
+  </w:abstractNum>
+  <w:abstractNum w:abstractNumId="11" w15:restartNumberingAfterBreak="0">
     <w:nsid w:val="36D1280F"/>
     <w:multiLevelType w:val="hybridMultilevel"/>
     <w:tmpl w:val="23E0C6D8"/>
@@ -3156,7 +3375,7 @@
       </w:rPr>
     </w:lvl>
   </w:abstractNum>
-  <w:abstractNum w:abstractNumId="9" w15:restartNumberingAfterBreak="0">
+  <w:abstractNum w:abstractNumId="12" w15:restartNumberingAfterBreak="0">
     <w:nsid w:val="38166087"/>
     <w:multiLevelType w:val="hybridMultilevel"/>
     <w:tmpl w:val="DAC43234"/>
@@ -3269,7 +3488,7 @@
       </w:rPr>
     </w:lvl>
   </w:abstractNum>
-  <w:abstractNum w:abstractNumId="10" w15:restartNumberingAfterBreak="0">
+  <w:abstractNum w:abstractNumId="13" w15:restartNumberingAfterBreak="0">
     <w:nsid w:val="3C821678"/>
     <w:multiLevelType w:val="hybridMultilevel"/>
     <w:tmpl w:val="7D267D3E"/>
@@ -3382,7 +3601,7 @@
       </w:rPr>
     </w:lvl>
   </w:abstractNum>
-  <w:abstractNum w:abstractNumId="11" w15:restartNumberingAfterBreak="0">
+  <w:abstractNum w:abstractNumId="14" w15:restartNumberingAfterBreak="0">
     <w:nsid w:val="3CEA2FE6"/>
     <w:multiLevelType w:val="multilevel"/>
     <w:tmpl w:val="70F28312"/>
@@ -3495,7 +3714,7 @@
       </w:rPr>
     </w:lvl>
   </w:abstractNum>
-  <w:abstractNum w:abstractNumId="12" w15:restartNumberingAfterBreak="0">
+  <w:abstractNum w:abstractNumId="15" w15:restartNumberingAfterBreak="0">
     <w:nsid w:val="3E1329BE"/>
     <w:multiLevelType w:val="hybridMultilevel"/>
     <w:tmpl w:val="2E8E5B5C"/>
@@ -3608,7 +3827,7 @@
       </w:rPr>
     </w:lvl>
   </w:abstractNum>
-  <w:abstractNum w:abstractNumId="13" w15:restartNumberingAfterBreak="0">
+  <w:abstractNum w:abstractNumId="16" w15:restartNumberingAfterBreak="0">
     <w:nsid w:val="402C2B7E"/>
     <w:multiLevelType w:val="multilevel"/>
     <w:tmpl w:val="9970DECA"/>
@@ -3721,7 +3940,119 @@
       </w:rPr>
     </w:lvl>
   </w:abstractNum>
-  <w:abstractNum w:abstractNumId="14" w15:restartNumberingAfterBreak="0">
+  <w:abstractNum w:abstractNumId="17" w15:restartNumberingAfterBreak="0">
+    <w:nsid w:val="428F1DE0"/>
+    <w:multiLevelType w:val="hybridMultilevel"/>
+    <w:tmpl w:val="12BE56C0"/>
+    <w:lvl w:ilvl="0" w:tplc="82C8935E">
+      <w:numFmt w:val="bullet"/>
+      <w:lvlText w:val="-"/>
+      <w:lvlJc w:val="left"/>
+      <w:pPr>
+        <w:ind w:left="720" w:hanging="360"/>
+      </w:pPr>
+      <w:rPr>
+        <w:rFonts w:ascii="Calibri" w:eastAsia="Spectral" w:hAnsi="Calibri" w:cs="Calibri" w:hint="default"/>
+      </w:rPr>
+    </w:lvl>
+    <w:lvl w:ilvl="1" w:tplc="04090003" w:tentative="1">
+      <w:start w:val="1"/>
+      <w:numFmt w:val="bullet"/>
+      <w:lvlText w:val="o"/>
+      <w:lvlJc w:val="left"/>
+      <w:pPr>
+        <w:ind w:left="1440" w:hanging="360"/>
+      </w:pPr>
+      <w:rPr>
+        <w:rFonts w:ascii="Courier New" w:hAnsi="Courier New" w:cs="Courier New" w:hint="default"/>
+      </w:rPr>
+    </w:lvl>
+    <w:lvl w:ilvl="2" w:tplc="04090005" w:tentative="1">
+      <w:start w:val="1"/>
+      <w:numFmt w:val="bullet"/>
+      <w:lvlText w:val=""/>
+      <w:lvlJc w:val="left"/>
+      <w:pPr>
+        <w:ind w:left="2160" w:hanging="360"/>
+      </w:pPr>
+      <w:rPr>
+        <w:rFonts w:ascii="Wingdings" w:hAnsi="Wingdings" w:hint="default"/>
+      </w:rPr>
+    </w:lvl>
+    <w:lvl w:ilvl="3" w:tplc="04090001" w:tentative="1">
+      <w:start w:val="1"/>
+      <w:numFmt w:val="bullet"/>
+      <w:lvlText w:val=""/>
+      <w:lvlJc w:val="left"/>
+      <w:pPr>
+        <w:ind w:left="2880" w:hanging="360"/>
+      </w:pPr>
+      <w:rPr>
+        <w:rFonts w:ascii="Symbol" w:hAnsi="Symbol" w:hint="default"/>
+      </w:rPr>
+    </w:lvl>
+    <w:lvl w:ilvl="4" w:tplc="04090003" w:tentative="1">
+      <w:start w:val="1"/>
+      <w:numFmt w:val="bullet"/>
+      <w:lvlText w:val="o"/>
+      <w:lvlJc w:val="left"/>
+      <w:pPr>
+        <w:ind w:left="3600" w:hanging="360"/>
+      </w:pPr>
+      <w:rPr>
+        <w:rFonts w:ascii="Courier New" w:hAnsi="Courier New" w:cs="Courier New" w:hint="default"/>
+      </w:rPr>
+    </w:lvl>
+    <w:lvl w:ilvl="5" w:tplc="04090005" w:tentative="1">
+      <w:start w:val="1"/>
+      <w:numFmt w:val="bullet"/>
+      <w:lvlText w:val=""/>
+      <w:lvlJc w:val="left"/>
+      <w:pPr>
+        <w:ind w:left="4320" w:hanging="360"/>
+      </w:pPr>
+      <w:rPr>
+        <w:rFonts w:ascii="Wingdings" w:hAnsi="Wingdings" w:hint="default"/>
+      </w:rPr>
+    </w:lvl>
+    <w:lvl w:ilvl="6" w:tplc="04090001" w:tentative="1">
+      <w:start w:val="1"/>
+      <w:numFmt w:val="bullet"/>
+      <w:lvlText w:val=""/>
+      <w:lvlJc w:val="left"/>
+      <w:pPr>
+        <w:ind w:left="5040" w:hanging="360"/>
+      </w:pPr>
+      <w:rPr>
+        <w:rFonts w:ascii="Symbol" w:hAnsi="Symbol" w:hint="default"/>
+      </w:rPr>
+    </w:lvl>
+    <w:lvl w:ilvl="7" w:tplc="04090003" w:tentative="1">
+      <w:start w:val="1"/>
+      <w:numFmt w:val="bullet"/>
+      <w:lvlText w:val="o"/>
+      <w:lvlJc w:val="left"/>
+      <w:pPr>
+        <w:ind w:left="5760" w:hanging="360"/>
+      </w:pPr>
+      <w:rPr>
+        <w:rFonts w:ascii="Courier New" w:hAnsi="Courier New" w:cs="Courier New" w:hint="default"/>
+      </w:rPr>
+    </w:lvl>
+    <w:lvl w:ilvl="8" w:tplc="04090005" w:tentative="1">
+      <w:start w:val="1"/>
+      <w:numFmt w:val="bullet"/>
+      <w:lvlText w:val=""/>
+      <w:lvlJc w:val="left"/>
+      <w:pPr>
+        <w:ind w:left="6480" w:hanging="360"/>
+      </w:pPr>
+      <w:rPr>
+        <w:rFonts w:ascii="Wingdings" w:hAnsi="Wingdings" w:hint="default"/>
+      </w:rPr>
+    </w:lvl>
+  </w:abstractNum>
+  <w:abstractNum w:abstractNumId="18" w15:restartNumberingAfterBreak="0">
     <w:nsid w:val="4AFA1A62"/>
     <w:multiLevelType w:val="hybridMultilevel"/>
     <w:tmpl w:val="BF56CEC6"/>
@@ -3834,7 +4165,7 @@
       </w:rPr>
     </w:lvl>
   </w:abstractNum>
-  <w:abstractNum w:abstractNumId="15" w15:restartNumberingAfterBreak="0">
+  <w:abstractNum w:abstractNumId="19" w15:restartNumberingAfterBreak="0">
     <w:nsid w:val="520712C4"/>
     <w:multiLevelType w:val="hybridMultilevel"/>
     <w:tmpl w:val="B8040AAA"/>
@@ -3947,7 +4278,7 @@
       </w:rPr>
     </w:lvl>
   </w:abstractNum>
-  <w:abstractNum w:abstractNumId="16" w15:restartNumberingAfterBreak="0">
+  <w:abstractNum w:abstractNumId="20" w15:restartNumberingAfterBreak="0">
     <w:nsid w:val="54FD2FAF"/>
     <w:multiLevelType w:val="hybridMultilevel"/>
     <w:tmpl w:val="30B28308"/>
@@ -4060,7 +4391,119 @@
       </w:rPr>
     </w:lvl>
   </w:abstractNum>
-  <w:abstractNum w:abstractNumId="17" w15:restartNumberingAfterBreak="0">
+  <w:abstractNum w:abstractNumId="21" w15:restartNumberingAfterBreak="0">
+    <w:nsid w:val="5D217CA8"/>
+    <w:multiLevelType w:val="hybridMultilevel"/>
+    <w:tmpl w:val="0FB4B34A"/>
+    <w:lvl w:ilvl="0" w:tplc="82C8935E">
+      <w:numFmt w:val="bullet"/>
+      <w:lvlText w:val="-"/>
+      <w:lvlJc w:val="left"/>
+      <w:pPr>
+        <w:ind w:left="720" w:hanging="360"/>
+      </w:pPr>
+      <w:rPr>
+        <w:rFonts w:ascii="Calibri" w:eastAsia="Spectral" w:hAnsi="Calibri" w:cs="Calibri" w:hint="default"/>
+      </w:rPr>
+    </w:lvl>
+    <w:lvl w:ilvl="1" w:tplc="04090003" w:tentative="1">
+      <w:start w:val="1"/>
+      <w:numFmt w:val="bullet"/>
+      <w:lvlText w:val="o"/>
+      <w:lvlJc w:val="left"/>
+      <w:pPr>
+        <w:ind w:left="1440" w:hanging="360"/>
+      </w:pPr>
+      <w:rPr>
+        <w:rFonts w:ascii="Courier New" w:hAnsi="Courier New" w:cs="Courier New" w:hint="default"/>
+      </w:rPr>
+    </w:lvl>
+    <w:lvl w:ilvl="2" w:tplc="04090005" w:tentative="1">
+      <w:start w:val="1"/>
+      <w:numFmt w:val="bullet"/>
+      <w:lvlText w:val=""/>
+      <w:lvlJc w:val="left"/>
+      <w:pPr>
+        <w:ind w:left="2160" w:hanging="360"/>
+      </w:pPr>
+      <w:rPr>
+        <w:rFonts w:ascii="Wingdings" w:hAnsi="Wingdings" w:hint="default"/>
+      </w:rPr>
+    </w:lvl>
+    <w:lvl w:ilvl="3" w:tplc="04090001" w:tentative="1">
+      <w:start w:val="1"/>
+      <w:numFmt w:val="bullet"/>
+      <w:lvlText w:val=""/>
+      <w:lvlJc w:val="left"/>
+      <w:pPr>
+        <w:ind w:left="2880" w:hanging="360"/>
+      </w:pPr>
+      <w:rPr>
+        <w:rFonts w:ascii="Symbol" w:hAnsi="Symbol" w:hint="default"/>
+      </w:rPr>
+    </w:lvl>
+    <w:lvl w:ilvl="4" w:tplc="04090003" w:tentative="1">
+      <w:start w:val="1"/>
+      <w:numFmt w:val="bullet"/>
+      <w:lvlText w:val="o"/>
+      <w:lvlJc w:val="left"/>
+      <w:pPr>
+        <w:ind w:left="3600" w:hanging="360"/>
+      </w:pPr>
+      <w:rPr>
+        <w:rFonts w:ascii="Courier New" w:hAnsi="Courier New" w:cs="Courier New" w:hint="default"/>
+      </w:rPr>
+    </w:lvl>
+    <w:lvl w:ilvl="5" w:tplc="04090005" w:tentative="1">
+      <w:start w:val="1"/>
+      <w:numFmt w:val="bullet"/>
+      <w:lvlText w:val=""/>
+      <w:lvlJc w:val="left"/>
+      <w:pPr>
+        <w:ind w:left="4320" w:hanging="360"/>
+      </w:pPr>
+      <w:rPr>
+        <w:rFonts w:ascii="Wingdings" w:hAnsi="Wingdings" w:hint="default"/>
+      </w:rPr>
+    </w:lvl>
+    <w:lvl w:ilvl="6" w:tplc="04090001" w:tentative="1">
+      <w:start w:val="1"/>
+      <w:numFmt w:val="bullet"/>
+      <w:lvlText w:val=""/>
+      <w:lvlJc w:val="left"/>
+      <w:pPr>
+        <w:ind w:left="5040" w:hanging="360"/>
+      </w:pPr>
+      <w:rPr>
+        <w:rFonts w:ascii="Symbol" w:hAnsi="Symbol" w:hint="default"/>
+      </w:rPr>
+    </w:lvl>
+    <w:lvl w:ilvl="7" w:tplc="04090003" w:tentative="1">
+      <w:start w:val="1"/>
+      <w:numFmt w:val="bullet"/>
+      <w:lvlText w:val="o"/>
+      <w:lvlJc w:val="left"/>
+      <w:pPr>
+        <w:ind w:left="5760" w:hanging="360"/>
+      </w:pPr>
+      <w:rPr>
+        <w:rFonts w:ascii="Courier New" w:hAnsi="Courier New" w:cs="Courier New" w:hint="default"/>
+      </w:rPr>
+    </w:lvl>
+    <w:lvl w:ilvl="8" w:tplc="04090005" w:tentative="1">
+      <w:start w:val="1"/>
+      <w:numFmt w:val="bullet"/>
+      <w:lvlText w:val=""/>
+      <w:lvlJc w:val="left"/>
+      <w:pPr>
+        <w:ind w:left="6480" w:hanging="360"/>
+      </w:pPr>
+      <w:rPr>
+        <w:rFonts w:ascii="Wingdings" w:hAnsi="Wingdings" w:hint="default"/>
+      </w:rPr>
+    </w:lvl>
+  </w:abstractNum>
+  <w:abstractNum w:abstractNumId="22" w15:restartNumberingAfterBreak="0">
     <w:nsid w:val="7ABF5739"/>
     <w:multiLevelType w:val="multilevel"/>
     <w:tmpl w:val="CD583D32"/>
@@ -4177,55 +4620,70 @@
     <w:abstractNumId w:val="0"/>
   </w:num>
   <w:num w:numId="2" w16cid:durableId="968583544">
-    <w:abstractNumId w:val="17"/>
+    <w:abstractNumId w:val="22"/>
   </w:num>
   <w:num w:numId="3" w16cid:durableId="39283691">
-    <w:abstractNumId w:val="7"/>
+    <w:abstractNumId w:val="9"/>
   </w:num>
   <w:num w:numId="4" w16cid:durableId="1352997362">
+    <w:abstractNumId w:val="16"/>
+  </w:num>
+  <w:num w:numId="5" w16cid:durableId="366837349">
+    <w:abstractNumId w:val="14"/>
+  </w:num>
+  <w:num w:numId="6" w16cid:durableId="704644527">
+    <w:abstractNumId w:val="18"/>
+  </w:num>
+  <w:num w:numId="7" w16cid:durableId="1049299726">
+    <w:abstractNumId w:val="20"/>
+  </w:num>
+  <w:num w:numId="8" w16cid:durableId="1777598942">
+    <w:abstractNumId w:val="15"/>
+  </w:num>
+  <w:num w:numId="9" w16cid:durableId="1306933773">
     <w:abstractNumId w:val="13"/>
   </w:num>
-  <w:num w:numId="5" w16cid:durableId="366837349">
-    <w:abstractNumId w:val="11"/>
-  </w:num>
-  <w:num w:numId="6" w16cid:durableId="704644527">
-    <w:abstractNumId w:val="14"/>
-  </w:num>
-  <w:num w:numId="7" w16cid:durableId="1049299726">
-    <w:abstractNumId w:val="16"/>
-  </w:num>
-  <w:num w:numId="8" w16cid:durableId="1777598942">
-    <w:abstractNumId w:val="12"/>
-  </w:num>
-  <w:num w:numId="9" w16cid:durableId="1306933773">
-    <w:abstractNumId w:val="10"/>
-  </w:num>
   <w:num w:numId="10" w16cid:durableId="1230310561">
-    <w:abstractNumId w:val="5"/>
+    <w:abstractNumId w:val="7"/>
   </w:num>
   <w:num w:numId="11" w16cid:durableId="1226989858">
     <w:abstractNumId w:val="1"/>
   </w:num>
   <w:num w:numId="12" w16cid:durableId="1017731416">
+    <w:abstractNumId w:val="4"/>
+  </w:num>
+  <w:num w:numId="13" w16cid:durableId="939945959">
+    <w:abstractNumId w:val="11"/>
+  </w:num>
+  <w:num w:numId="14" w16cid:durableId="741176075">
+    <w:abstractNumId w:val="12"/>
+  </w:num>
+  <w:num w:numId="15" w16cid:durableId="790435444">
+    <w:abstractNumId w:val="8"/>
+  </w:num>
+  <w:num w:numId="16" w16cid:durableId="388959194">
+    <w:abstractNumId w:val="5"/>
+  </w:num>
+  <w:num w:numId="17" w16cid:durableId="696664627">
     <w:abstractNumId w:val="3"/>
   </w:num>
-  <w:num w:numId="13" w16cid:durableId="939945959">
-    <w:abstractNumId w:val="8"/>
+  <w:num w:numId="18" w16cid:durableId="565920947">
+    <w:abstractNumId w:val="19"/>
   </w:num>
-  <w:num w:numId="14" w16cid:durableId="741176075">
-    <w:abstractNumId w:val="9"/>
-  </w:num>
-  <w:num w:numId="15" w16cid:durableId="790435444">
-    <w:abstractNumId w:val="6"/>
-  </w:num>
-  <w:num w:numId="16" w16cid:durableId="388959194">
-    <w:abstractNumId w:val="4"/>
-  </w:num>
-  <w:num w:numId="17" w16cid:durableId="696664627">
+  <w:num w:numId="19" w16cid:durableId="1889759751">
     <w:abstractNumId w:val="2"/>
   </w:num>
-  <w:num w:numId="18" w16cid:durableId="565920947">
-    <w:abstractNumId w:val="15"/>
+  <w:num w:numId="20" w16cid:durableId="243952748">
+    <w:abstractNumId w:val="17"/>
+  </w:num>
+  <w:num w:numId="21" w16cid:durableId="86466520">
+    <w:abstractNumId w:val="10"/>
+  </w:num>
+  <w:num w:numId="22" w16cid:durableId="935989677">
+    <w:abstractNumId w:val="21"/>
+  </w:num>
+  <w:num w:numId="23" w16cid:durableId="23749986">
+    <w:abstractNumId w:val="6"/>
   </w:num>
 </w:numbering>
 </file>

</xml_diff>

<commit_message>
Update portfolio with 2026 resume
</commit_message>
<xml_diff>
--- a/images/Ziv_Cohen_2026_Resume.docx
+++ b/images/Ziv_Cohen_2026_Resume.docx
@@ -188,7 +188,7 @@
       <w:pPr>
         <w:tabs>
           <w:tab w:val="left" w:pos="1134"/>
-          <w:tab w:val="right" w:pos="10710"/>
+          <w:tab w:val="right" w:pos="11250"/>
         </w:tabs>
         <w:spacing w:line="240" w:lineRule="auto"/>
         <w:rPr>
@@ -233,16 +233,135 @@
         </w:rPr>
         <w:t>Lawrence, KS</w:t>
       </w:r>
-      <w:r>
-        <w:rPr>
-          <w:rFonts w:ascii="Calibri" w:eastAsia="Spectral" w:hAnsi="Calibri" w:cs="Calibri"/>
-          <w:b/>
-          <w:bCs/>
+    </w:p>
+    <w:p>
+      <w:pPr>
+        <w:tabs>
+          <w:tab w:val="left" w:pos="1134"/>
+          <w:tab w:val="right" w:pos="11250"/>
+        </w:tabs>
+        <w:spacing w:line="240" w:lineRule="auto"/>
+        <w:rPr>
+          <w:rFonts w:ascii="Calibri" w:eastAsia="Spectral" w:hAnsi="Calibri" w:cs="Calibri"/>
           <w:sz w:val="20"/>
           <w:szCs w:val="20"/>
           <w:lang w:val="en-US"/>
         </w:rPr>
+      </w:pPr>
+      <w:r>
+        <w:rPr>
+          <w:rFonts w:ascii="Calibri" w:eastAsia="Spectral" w:hAnsi="Calibri" w:cs="Calibri"/>
+          <w:sz w:val="20"/>
+          <w:szCs w:val="20"/>
+          <w:lang w:val="en-US"/>
+        </w:rPr>
+        <w:t>B</w:t>
+      </w:r>
+      <w:r>
+        <w:rPr>
+          <w:rFonts w:ascii="Calibri" w:eastAsia="Spectral" w:hAnsi="Calibri" w:cs="Calibri"/>
+          <w:sz w:val="20"/>
+          <w:szCs w:val="20"/>
+          <w:lang w:val="en-US"/>
+        </w:rPr>
+        <w:t>achelor of Science</w:t>
+      </w:r>
+      <w:r>
+        <w:rPr>
+          <w:rFonts w:ascii="Calibri" w:eastAsia="Spectral" w:hAnsi="Calibri" w:cs="Calibri"/>
+          <w:sz w:val="20"/>
+          <w:szCs w:val="20"/>
+          <w:lang w:val="en-US"/>
+        </w:rPr>
+        <w:t xml:space="preserve"> in </w:t>
+      </w:r>
+      <w:r>
+        <w:rPr>
+          <w:rFonts w:ascii="Calibri" w:eastAsia="Spectral" w:hAnsi="Calibri" w:cs="Calibri"/>
+          <w:sz w:val="20"/>
+          <w:szCs w:val="20"/>
+          <w:lang w:val="en-US"/>
+        </w:rPr>
+        <w:t>Computer Science</w:t>
+      </w:r>
+      <w:r>
+        <w:rPr>
+          <w:rFonts w:ascii="Calibri" w:eastAsia="Spectral" w:hAnsi="Calibri" w:cs="Calibri"/>
+          <w:sz w:val="20"/>
+          <w:szCs w:val="20"/>
+          <w:lang w:val="en-US"/>
+        </w:rPr>
+        <w:t xml:space="preserve">, </w:t>
+      </w:r>
+      <w:r>
+        <w:rPr>
+          <w:rFonts w:ascii="Calibri" w:eastAsia="Spectral" w:hAnsi="Calibri" w:cs="Calibri"/>
+          <w:i/>
+          <w:iCs/>
+          <w:sz w:val="20"/>
+          <w:szCs w:val="20"/>
+          <w:lang w:val="en-US"/>
+        </w:rPr>
+        <w:t xml:space="preserve">SELF </w:t>
+      </w:r>
+      <w:r>
+        <w:rPr>
+          <w:rFonts w:ascii="Calibri" w:eastAsia="Spectral" w:hAnsi="Calibri" w:cs="Calibri"/>
+          <w:i/>
+          <w:iCs/>
+          <w:sz w:val="20"/>
+          <w:szCs w:val="20"/>
+          <w:lang w:val="en-US"/>
+        </w:rPr>
+        <w:t>Fellow</w:t>
+      </w:r>
+      <w:r>
+        <w:rPr>
+          <w:rFonts w:ascii="Calibri" w:eastAsia="Spectral" w:hAnsi="Calibri" w:cs="Calibri"/>
+          <w:i/>
+          <w:iCs/>
+          <w:sz w:val="20"/>
+          <w:szCs w:val="20"/>
+          <w:lang w:val="en-US"/>
+        </w:rPr>
+        <w:t xml:space="preserve">, </w:t>
+      </w:r>
+      <w:r>
+        <w:rPr>
+          <w:rFonts w:ascii="Calibri" w:eastAsia="Spectral" w:hAnsi="Calibri" w:cs="Calibri"/>
+          <w:i/>
+          <w:iCs/>
+          <w:sz w:val="20"/>
+          <w:szCs w:val="20"/>
+          <w:lang w:val="en-US"/>
+        </w:rPr>
+        <w:t>University Honors Program,</w:t>
+      </w:r>
+      <w:r>
+        <w:rPr>
+          <w:rFonts w:ascii="Calibri" w:eastAsia="Spectral" w:hAnsi="Calibri" w:cs="Calibri"/>
+          <w:sz w:val="20"/>
+          <w:szCs w:val="20"/>
+          <w:lang w:val="en-US"/>
+        </w:rPr>
+        <w:t xml:space="preserve"> GPA: 3.88</w:t>
+      </w:r>
+      <w:r>
+        <w:rPr>
+          <w:rFonts w:ascii="Calibri" w:eastAsia="Spectral" w:hAnsi="Calibri" w:cs="Calibri"/>
+          <w:b/>
+          <w:smallCaps/>
+        </w:rPr>
         <w:tab/>
+      </w:r>
+      <w:r>
+        <w:rPr>
+          <w:rFonts w:ascii="Calibri" w:eastAsia="Spectral" w:hAnsi="Calibri" w:cs="Calibri"/>
+          <w:sz w:val="20"/>
+          <w:szCs w:val="20"/>
+          <w:lang w:val="en-US"/>
+        </w:rPr>
+        <w:t>Anticipated May 2028</w:t>
       </w:r>
     </w:p>
     <w:p>
@@ -254,136 +373,6 @@
         <w:spacing w:line="240" w:lineRule="auto"/>
         <w:rPr>
           <w:rFonts w:ascii="Calibri" w:eastAsia="Spectral" w:hAnsi="Calibri" w:cs="Calibri"/>
-          <w:sz w:val="20"/>
-          <w:szCs w:val="20"/>
-          <w:lang w:val="en-US"/>
-        </w:rPr>
-      </w:pPr>
-      <w:r>
-        <w:rPr>
-          <w:rFonts w:ascii="Calibri" w:eastAsia="Spectral" w:hAnsi="Calibri" w:cs="Calibri"/>
-          <w:sz w:val="20"/>
-          <w:szCs w:val="20"/>
-          <w:lang w:val="en-US"/>
-        </w:rPr>
-        <w:t>B</w:t>
-      </w:r>
-      <w:r>
-        <w:rPr>
-          <w:rFonts w:ascii="Calibri" w:eastAsia="Spectral" w:hAnsi="Calibri" w:cs="Calibri"/>
-          <w:sz w:val="20"/>
-          <w:szCs w:val="20"/>
-          <w:lang w:val="en-US"/>
-        </w:rPr>
-        <w:t>achelor of Science</w:t>
-      </w:r>
-      <w:r>
-        <w:rPr>
-          <w:rFonts w:ascii="Calibri" w:eastAsia="Spectral" w:hAnsi="Calibri" w:cs="Calibri"/>
-          <w:sz w:val="20"/>
-          <w:szCs w:val="20"/>
-          <w:lang w:val="en-US"/>
-        </w:rPr>
-        <w:t xml:space="preserve"> in </w:t>
-      </w:r>
-      <w:r>
-        <w:rPr>
-          <w:rFonts w:ascii="Calibri" w:eastAsia="Spectral" w:hAnsi="Calibri" w:cs="Calibri"/>
-          <w:sz w:val="20"/>
-          <w:szCs w:val="20"/>
-          <w:lang w:val="en-US"/>
-        </w:rPr>
-        <w:t>Computer Science</w:t>
-      </w:r>
-      <w:r>
-        <w:rPr>
-          <w:rFonts w:ascii="Calibri" w:eastAsia="Spectral" w:hAnsi="Calibri" w:cs="Calibri"/>
-          <w:sz w:val="20"/>
-          <w:szCs w:val="20"/>
-          <w:lang w:val="en-US"/>
-        </w:rPr>
-        <w:t xml:space="preserve">, </w:t>
-      </w:r>
-      <w:r>
-        <w:rPr>
-          <w:rFonts w:ascii="Calibri" w:eastAsia="Spectral" w:hAnsi="Calibri" w:cs="Calibri"/>
-          <w:i/>
-          <w:iCs/>
-          <w:sz w:val="20"/>
-          <w:szCs w:val="20"/>
-          <w:lang w:val="en-US"/>
-        </w:rPr>
-        <w:t xml:space="preserve">SELF </w:t>
-      </w:r>
-      <w:r>
-        <w:rPr>
-          <w:rFonts w:ascii="Calibri" w:eastAsia="Spectral" w:hAnsi="Calibri" w:cs="Calibri"/>
-          <w:i/>
-          <w:iCs/>
-          <w:sz w:val="20"/>
-          <w:szCs w:val="20"/>
-          <w:lang w:val="en-US"/>
-        </w:rPr>
-        <w:t>Fellow</w:t>
-      </w:r>
-      <w:r>
-        <w:rPr>
-          <w:rFonts w:ascii="Calibri" w:eastAsia="Spectral" w:hAnsi="Calibri" w:cs="Calibri"/>
-          <w:i/>
-          <w:iCs/>
-          <w:sz w:val="20"/>
-          <w:szCs w:val="20"/>
-          <w:lang w:val="en-US"/>
-        </w:rPr>
-        <w:t xml:space="preserve">, </w:t>
-      </w:r>
-      <w:r>
-        <w:rPr>
-          <w:rFonts w:ascii="Calibri" w:eastAsia="Spectral" w:hAnsi="Calibri" w:cs="Calibri"/>
-          <w:i/>
-          <w:iCs/>
-          <w:sz w:val="20"/>
-          <w:szCs w:val="20"/>
-          <w:lang w:val="en-US"/>
-        </w:rPr>
-        <w:t>University Honors Program,</w:t>
-      </w:r>
-      <w:r>
-        <w:rPr>
-          <w:rFonts w:ascii="Calibri" w:eastAsia="Spectral" w:hAnsi="Calibri" w:cs="Calibri"/>
-          <w:sz w:val="20"/>
-          <w:szCs w:val="20"/>
-          <w:lang w:val="en-US"/>
-        </w:rPr>
-        <w:t xml:space="preserve"> GPA: 3.88</w:t>
-      </w:r>
-      <w:r>
-        <w:rPr>
-          <w:rFonts w:ascii="Calibri" w:eastAsia="Spectral" w:hAnsi="Calibri" w:cs="Calibri"/>
-          <w:b/>
-          <w:smallCaps/>
-        </w:rPr>
-        <w:tab/>
-      </w:r>
-      <w:r>
-        <w:rPr>
-          <w:rFonts w:ascii="Calibri" w:eastAsia="Spectral" w:hAnsi="Calibri" w:cs="Calibri"/>
-          <w:sz w:val="20"/>
-          <w:szCs w:val="20"/>
-          <w:lang w:val="en-US"/>
-        </w:rPr>
-        <w:t>Anticipated May 2028</w:t>
-      </w:r>
-    </w:p>
-    <w:p>
-      <w:pPr>
-        <w:tabs>
-          <w:tab w:val="left" w:pos="1134"/>
-          <w:tab w:val="right" w:pos="10710"/>
-        </w:tabs>
-        <w:spacing w:line="240" w:lineRule="auto"/>
-        <w:rPr>
-          <w:rFonts w:ascii="Calibri" w:eastAsia="Spectral" w:hAnsi="Calibri" w:cs="Calibri"/>
           <w:sz w:val="4"/>
           <w:szCs w:val="4"/>
           <w:lang w:val="en-US"/>
@@ -394,7 +383,7 @@
       <w:pPr>
         <w:tabs>
           <w:tab w:val="left" w:pos="1134"/>
-          <w:tab w:val="right" w:pos="10710"/>
+          <w:tab w:val="right" w:pos="11250"/>
         </w:tabs>
         <w:spacing w:line="240" w:lineRule="auto"/>
         <w:rPr>
@@ -472,9 +461,11 @@
     <w:p>
       <w:pPr>
         <w:tabs>
-          <w:tab w:val="right" w:pos="8730"/>
+          <w:tab w:val="right" w:pos="9180"/>
+          <w:tab w:val="left" w:pos="9810"/>
         </w:tabs>
         <w:spacing w:line="240" w:lineRule="auto"/>
+        <w:ind w:right="-418"/>
         <w:rPr>
           <w:rFonts w:ascii="Calibri" w:eastAsia="Spectral" w:hAnsi="Calibri" w:cs="Calibri"/>
           <w:b/>
@@ -523,7 +514,7 @@
     <w:p>
       <w:pPr>
         <w:tabs>
-          <w:tab w:val="right" w:pos="10710"/>
+          <w:tab w:val="right" w:pos="11250"/>
         </w:tabs>
         <w:spacing w:line="240" w:lineRule="auto"/>
         <w:rPr>
@@ -688,7 +679,7 @@
     <w:p>
       <w:pPr>
         <w:tabs>
-          <w:tab w:val="right" w:pos="10710"/>
+          <w:tab w:val="right" w:pos="11250"/>
         </w:tabs>
         <w:spacing w:line="240" w:lineRule="auto"/>
         <w:rPr>
@@ -721,7 +712,7 @@
     <w:p>
       <w:pPr>
         <w:tabs>
-          <w:tab w:val="right" w:pos="10710"/>
+          <w:tab w:val="right" w:pos="11250"/>
         </w:tabs>
         <w:spacing w:line="240" w:lineRule="auto"/>
         <w:rPr>
@@ -820,17 +811,7 @@
           <w:sz w:val="20"/>
           <w:szCs w:val="20"/>
         </w:rPr>
-        <w:t xml:space="preserve">Research </w:t>
-      </w:r>
-      <w:proofErr w:type="gramStart"/>
-      <w:r>
-        <w:rPr>
-          <w:rFonts w:ascii="Calibri" w:eastAsia="Spectral" w:hAnsi="Calibri" w:cs="Calibri"/>
-          <w:bCs/>
-          <w:sz w:val="20"/>
-          <w:szCs w:val="20"/>
-        </w:rPr>
-        <w:t>venue</w:t>
+        <w:t>Research venue</w:t>
       </w:r>
       <w:r>
         <w:rPr>
@@ -841,7 +822,6 @@
         </w:rPr>
         <w:t>’s</w:t>
       </w:r>
-      <w:proofErr w:type="gramEnd"/>
       <w:r>
         <w:rPr>
           <w:rFonts w:ascii="Calibri" w:eastAsia="Spectral" w:hAnsi="Calibri" w:cs="Calibri"/>
@@ -884,7 +864,7 @@
     <w:p>
       <w:pPr>
         <w:tabs>
-          <w:tab w:val="right" w:pos="10710"/>
+          <w:tab w:val="right" w:pos="11250"/>
         </w:tabs>
         <w:spacing w:line="240" w:lineRule="auto"/>
         <w:rPr>
@@ -917,7 +897,7 @@
     <w:p>
       <w:pPr>
         <w:tabs>
-          <w:tab w:val="right" w:pos="10710"/>
+          <w:tab w:val="right" w:pos="11250"/>
         </w:tabs>
         <w:spacing w:line="240" w:lineRule="auto"/>
         <w:rPr>
@@ -1009,7 +989,7 @@
     <w:p>
       <w:pPr>
         <w:tabs>
-          <w:tab w:val="right" w:pos="10710"/>
+          <w:tab w:val="right" w:pos="11250"/>
         </w:tabs>
         <w:spacing w:line="240" w:lineRule="auto"/>
         <w:rPr>
@@ -1210,7 +1190,7 @@
     <w:p>
       <w:pPr>
         <w:tabs>
-          <w:tab w:val="right" w:pos="10710"/>
+          <w:tab w:val="right" w:pos="11250"/>
         </w:tabs>
         <w:spacing w:line="240" w:lineRule="auto"/>
         <w:rPr>
@@ -1471,13 +1451,13 @@
           <w:sz w:val="20"/>
           <w:szCs w:val="20"/>
         </w:rPr>
-        <w:t>Implemented Unity’s built-in inverse kinematics solver to translate user input into coordinated joint movement and improve control of the robotic arm</w:t>
+        <w:t xml:space="preserve">Implemented Unity’s built-in inverse kinematics solver to translate user input into coordinated joint movement and improve control </w:t>
       </w:r>
     </w:p>
     <w:p>
       <w:pPr>
         <w:tabs>
-          <w:tab w:val="right" w:pos="10710"/>
+          <w:tab w:val="right" w:pos="11250"/>
         </w:tabs>
         <w:spacing w:line="240" w:lineRule="auto"/>
         <w:rPr>
@@ -1668,8 +1648,7 @@
       <w:pPr>
         <w:tabs>
           <w:tab w:val="left" w:pos="1134"/>
-          <w:tab w:val="right" w:pos="10710"/>
-          <w:tab w:val="right" w:pos="10800"/>
+          <w:tab w:val="right" w:pos="11250"/>
         </w:tabs>
         <w:spacing w:line="240" w:lineRule="auto"/>
         <w:rPr>
@@ -1795,8 +1774,7 @@
     <w:p>
       <w:pPr>
         <w:tabs>
-          <w:tab w:val="left" w:pos="1134"/>
-          <w:tab w:val="right" w:pos="10503"/>
+          <w:tab w:val="right" w:pos="11250"/>
         </w:tabs>
         <w:spacing w:line="240" w:lineRule="auto"/>
         <w:rPr>
@@ -1815,25 +1793,16 @@
           <w:sz w:val="20"/>
           <w:szCs w:val="20"/>
         </w:rPr>
-        <w:t xml:space="preserve">University of Kansas Pickleball </w:t>
-      </w:r>
-      <w:r>
-        <w:rPr>
-          <w:rFonts w:ascii="Calibri" w:eastAsia="Spectral" w:hAnsi="Calibri" w:cs="Calibri"/>
-          <w:b/>
-          <w:sz w:val="20"/>
-          <w:szCs w:val="20"/>
-        </w:rPr>
-        <w:t>Tea</w:t>
-      </w:r>
-      <w:r>
-        <w:rPr>
-          <w:rFonts w:ascii="Calibri" w:eastAsia="Spectral" w:hAnsi="Calibri" w:cs="Calibri"/>
-          <w:b/>
-          <w:sz w:val="20"/>
-          <w:szCs w:val="20"/>
-        </w:rPr>
-        <w:t xml:space="preserve">m (D1 Affiliated), </w:t>
+        <w:t xml:space="preserve">University of Kansas </w:t>
+      </w:r>
+      <w:r>
+        <w:rPr>
+          <w:rFonts w:ascii="Calibri" w:eastAsia="Spectral" w:hAnsi="Calibri" w:cs="Calibri"/>
+          <w:b/>
+          <w:sz w:val="20"/>
+          <w:szCs w:val="20"/>
+        </w:rPr>
+        <w:t xml:space="preserve">Consulting Club, </w:t>
       </w:r>
       <w:r>
         <w:rPr>
@@ -1844,7 +1813,7 @@
           <w:sz w:val="20"/>
           <w:szCs w:val="20"/>
         </w:rPr>
-        <w:t xml:space="preserve">Vice President </w:t>
+        <w:t>member</w:t>
       </w:r>
       <w:r>
         <w:rPr>
@@ -1855,30 +1824,8 @@
           <w:sz w:val="20"/>
           <w:szCs w:val="20"/>
         </w:rPr>
-        <w:t xml:space="preserve">   </w:t>
-      </w:r>
-      <w:r>
-        <w:rPr>
-          <w:rFonts w:ascii="Calibri" w:eastAsia="Spectral" w:hAnsi="Calibri" w:cs="Calibri"/>
-          <w:bCs/>
-          <w:i/>
-          <w:iCs/>
-          <w:sz w:val="20"/>
-          <w:szCs w:val="20"/>
-        </w:rPr>
         <w:tab/>
-        <w:t xml:space="preserve"> </w:t>
-      </w:r>
-      <w:r>
-        <w:rPr>
-          <w:rFonts w:ascii="Calibri" w:eastAsia="Spectral" w:hAnsi="Calibri" w:cs="Calibri"/>
-          <w:bCs/>
-          <w:i/>
-          <w:iCs/>
-          <w:sz w:val="20"/>
-          <w:szCs w:val="20"/>
-        </w:rPr>
-        <w:t>August 2024-Present</w:t>
+        <w:t>August 2026-Present</w:t>
       </w:r>
     </w:p>
     <w:p>
@@ -1907,99 +1854,122 @@
           <w:sz w:val="20"/>
           <w:szCs w:val="20"/>
         </w:rPr>
-        <w:t>Compete nationally against other universities in pickleball tournaments</w:t>
+        <w:t xml:space="preserve">Engage in bi-weekly consulting club meetings to explore </w:t>
+      </w:r>
+      <w:r>
+        <w:rPr>
+          <w:rFonts w:ascii="Calibri" w:eastAsia="Spectral" w:hAnsi="Calibri" w:cs="Calibri"/>
+          <w:bCs/>
+          <w:sz w:val="20"/>
+          <w:szCs w:val="20"/>
+        </w:rPr>
+        <w:t>consulting</w:t>
+      </w:r>
+      <w:r>
+        <w:rPr>
+          <w:rFonts w:ascii="Calibri" w:eastAsia="Spectral" w:hAnsi="Calibri" w:cs="Calibri"/>
+          <w:bCs/>
+          <w:sz w:val="20"/>
+          <w:szCs w:val="20"/>
+        </w:rPr>
+        <w:t>, strengthen business knowledge, and learn how consulting firms approach client problems</w:t>
       </w:r>
     </w:p>
     <w:p>
       <w:pPr>
-        <w:tabs>
-          <w:tab w:val="right" w:pos="8730"/>
-        </w:tabs>
+        <w:pBdr>
+          <w:bottom w:val="single" w:sz="6" w:space="1" w:color="000000"/>
+        </w:pBdr>
         <w:spacing w:line="240" w:lineRule="auto"/>
         <w:rPr>
           <w:rFonts w:ascii="Calibri" w:eastAsia="Spectral" w:hAnsi="Calibri" w:cs="Calibri"/>
-          <w:bCs/>
-          <w:i/>
-          <w:iCs/>
-          <w:sz w:val="20"/>
-          <w:szCs w:val="20"/>
-        </w:rPr>
-      </w:pPr>
-      <w:r>
-        <w:rPr>
-          <w:rFonts w:ascii="Calibri" w:eastAsia="Spectral" w:hAnsi="Calibri" w:cs="Calibri"/>
-          <w:b/>
-          <w:sz w:val="20"/>
-          <w:szCs w:val="20"/>
-        </w:rPr>
-        <w:t xml:space="preserve">University of Kansas </w:t>
-      </w:r>
-      <w:r>
-        <w:rPr>
-          <w:rFonts w:ascii="Calibri" w:eastAsia="Spectral" w:hAnsi="Calibri" w:cs="Calibri"/>
-          <w:b/>
-          <w:sz w:val="20"/>
-          <w:szCs w:val="20"/>
-        </w:rPr>
-        <w:t xml:space="preserve">Consulting Club, </w:t>
-      </w:r>
-      <w:r>
-        <w:rPr>
-          <w:rFonts w:ascii="Calibri" w:eastAsia="Spectral" w:hAnsi="Calibri" w:cs="Calibri"/>
-          <w:bCs/>
-          <w:i/>
-          <w:iCs/>
-          <w:sz w:val="20"/>
-          <w:szCs w:val="20"/>
-        </w:rPr>
-        <w:t>member</w:t>
+          <w:b/>
+          <w:smallCaps/>
+        </w:rPr>
+      </w:pPr>
+      <w:r>
+        <w:rPr>
+          <w:rFonts w:ascii="Calibri" w:eastAsia="Spectral" w:hAnsi="Calibri" w:cs="Calibri"/>
+          <w:b/>
+          <w:smallCaps/>
+        </w:rPr>
+        <w:t>SKILLS</w:t>
       </w:r>
     </w:p>
     <w:p>
       <w:pPr>
-        <w:pStyle w:val="ListParagraph"/>
-        <w:numPr>
-          <w:ilvl w:val="0"/>
-          <w:numId w:val="16"/>
-        </w:numPr>
-        <w:tabs>
-          <w:tab w:val="right" w:pos="8730"/>
-        </w:tabs>
         <w:spacing w:line="240" w:lineRule="auto"/>
-        <w:ind w:left="432" w:hanging="288"/>
-        <w:rPr>
-          <w:rFonts w:ascii="Calibri" w:eastAsia="Spectral" w:hAnsi="Calibri" w:cs="Calibri"/>
-          <w:bCs/>
-          <w:sz w:val="20"/>
-          <w:szCs w:val="20"/>
-        </w:rPr>
-      </w:pPr>
-      <w:r>
-        <w:rPr>
-          <w:rFonts w:ascii="Calibri" w:eastAsia="Spectral" w:hAnsi="Calibri" w:cs="Calibri"/>
-          <w:bCs/>
-          <w:sz w:val="20"/>
-          <w:szCs w:val="20"/>
-        </w:rPr>
-        <w:t xml:space="preserve">Engage in bi-weekly consulting club meetings to explore </w:t>
-      </w:r>
-      <w:r>
-        <w:rPr>
-          <w:rFonts w:ascii="Calibri" w:eastAsia="Spectral" w:hAnsi="Calibri" w:cs="Calibri"/>
-          <w:bCs/>
-          <w:sz w:val="20"/>
-          <w:szCs w:val="20"/>
-        </w:rPr>
-        <w:t>consulting</w:t>
-      </w:r>
-      <w:r>
-        <w:rPr>
-          <w:rFonts w:ascii="Calibri" w:eastAsia="Spectral" w:hAnsi="Calibri" w:cs="Calibri"/>
-          <w:bCs/>
-          <w:sz w:val="20"/>
-          <w:szCs w:val="20"/>
-        </w:rPr>
-        <w:t>, strengthen business knowledge, and learn how consulting firms approach client problems</w:t>
+        <w:rPr>
+          <w:rFonts w:ascii="Calibri" w:eastAsia="Spectral" w:hAnsi="Calibri" w:cs="Calibri"/>
+          <w:b/>
+          <w:sz w:val="20"/>
+          <w:szCs w:val="20"/>
+        </w:rPr>
+      </w:pPr>
+      <w:r>
+        <w:rPr>
+          <w:rFonts w:ascii="Calibri" w:eastAsia="Spectral" w:hAnsi="Calibri" w:cs="Calibri"/>
+          <w:b/>
+          <w:sz w:val="20"/>
+          <w:szCs w:val="20"/>
+        </w:rPr>
+        <w:t>Technical</w:t>
+      </w:r>
+      <w:r>
+        <w:rPr>
+          <w:rFonts w:ascii="Calibri" w:eastAsia="Spectral" w:hAnsi="Calibri" w:cs="Calibri"/>
+          <w:b/>
+          <w:sz w:val="20"/>
+          <w:szCs w:val="20"/>
+        </w:rPr>
+        <w:t xml:space="preserve"> - </w:t>
+      </w:r>
+      <w:r>
+        <w:rPr>
+          <w:rFonts w:ascii="Calibri" w:eastAsia="Spectral" w:hAnsi="Calibri" w:cs="Calibri"/>
+          <w:bCs/>
+          <w:sz w:val="20"/>
+          <w:szCs w:val="20"/>
+        </w:rPr>
+        <w:t>Jira, Python, C++, C, Git, YAML, Embedded Systems, Microsoft Excel and PowerPoint</w:t>
+      </w:r>
+    </w:p>
+    <w:p>
+      <w:pPr>
+        <w:spacing w:line="240" w:lineRule="auto"/>
+        <w:rPr>
+          <w:rFonts w:ascii="Calibri" w:eastAsia="Spectral" w:hAnsi="Calibri" w:cs="Calibri"/>
+          <w:b/>
+          <w:sz w:val="20"/>
+          <w:szCs w:val="20"/>
+        </w:rPr>
+      </w:pPr>
+      <w:r>
+        <w:rPr>
+          <w:rFonts w:ascii="Calibri" w:eastAsia="Spectral" w:hAnsi="Calibri" w:cs="Calibri"/>
+          <w:b/>
+          <w:sz w:val="20"/>
+          <w:szCs w:val="20"/>
+        </w:rPr>
+        <w:t>Professional</w:t>
+      </w:r>
+      <w:r>
+        <w:rPr>
+          <w:rFonts w:ascii="Calibri" w:eastAsia="Spectral" w:hAnsi="Calibri" w:cs="Calibri"/>
+          <w:b/>
+          <w:sz w:val="20"/>
+          <w:szCs w:val="20"/>
+        </w:rPr>
+        <w:t xml:space="preserve"> - </w:t>
+      </w:r>
+      <w:r>
+        <w:rPr>
+          <w:rFonts w:ascii="Calibri" w:eastAsia="Spectral" w:hAnsi="Calibri" w:cs="Calibri"/>
+          <w:bCs/>
+          <w:sz w:val="20"/>
+          <w:szCs w:val="20"/>
+        </w:rPr>
+        <w:t>Business Development, Project Management, Requirements Analysis, Public Speaking, Team Collaboration</w:t>
       </w:r>
     </w:p>
     <w:sectPr>
@@ -2700,119 +2670,6 @@
     </w:lvl>
   </w:abstractNum>
   <w:abstractNum w:abstractNumId="6" w15:restartNumberingAfterBreak="0">
-    <w:nsid w:val="1F47293C"/>
-    <w:multiLevelType w:val="hybridMultilevel"/>
-    <w:tmpl w:val="567423AE"/>
-    <w:lvl w:ilvl="0" w:tplc="04090001">
-      <w:start w:val="1"/>
-      <w:numFmt w:val="bullet"/>
-      <w:lvlText w:val=""/>
-      <w:lvlJc w:val="left"/>
-      <w:pPr>
-        <w:ind w:left="720" w:hanging="360"/>
-      </w:pPr>
-      <w:rPr>
-        <w:rFonts w:ascii="Symbol" w:hAnsi="Symbol" w:hint="default"/>
-      </w:rPr>
-    </w:lvl>
-    <w:lvl w:ilvl="1" w:tplc="04090003" w:tentative="1">
-      <w:start w:val="1"/>
-      <w:numFmt w:val="bullet"/>
-      <w:lvlText w:val="o"/>
-      <w:lvlJc w:val="left"/>
-      <w:pPr>
-        <w:ind w:left="1440" w:hanging="360"/>
-      </w:pPr>
-      <w:rPr>
-        <w:rFonts w:ascii="Courier New" w:hAnsi="Courier New" w:cs="Courier New" w:hint="default"/>
-      </w:rPr>
-    </w:lvl>
-    <w:lvl w:ilvl="2" w:tplc="04090005" w:tentative="1">
-      <w:start w:val="1"/>
-      <w:numFmt w:val="bullet"/>
-      <w:lvlText w:val=""/>
-      <w:lvlJc w:val="left"/>
-      <w:pPr>
-        <w:ind w:left="2160" w:hanging="360"/>
-      </w:pPr>
-      <w:rPr>
-        <w:rFonts w:ascii="Wingdings" w:hAnsi="Wingdings" w:hint="default"/>
-      </w:rPr>
-    </w:lvl>
-    <w:lvl w:ilvl="3" w:tplc="04090001" w:tentative="1">
-      <w:start w:val="1"/>
-      <w:numFmt w:val="bullet"/>
-      <w:lvlText w:val=""/>
-      <w:lvlJc w:val="left"/>
-      <w:pPr>
-        <w:ind w:left="2880" w:hanging="360"/>
-      </w:pPr>
-      <w:rPr>
-        <w:rFonts w:ascii="Symbol" w:hAnsi="Symbol" w:hint="default"/>
-      </w:rPr>
-    </w:lvl>
-    <w:lvl w:ilvl="4" w:tplc="04090003" w:tentative="1">
-      <w:start w:val="1"/>
-      <w:numFmt w:val="bullet"/>
-      <w:lvlText w:val="o"/>
-      <w:lvlJc w:val="left"/>
-      <w:pPr>
-        <w:ind w:left="3600" w:hanging="360"/>
-      </w:pPr>
-      <w:rPr>
-        <w:rFonts w:ascii="Courier New" w:hAnsi="Courier New" w:cs="Courier New" w:hint="default"/>
-      </w:rPr>
-    </w:lvl>
-    <w:lvl w:ilvl="5" w:tplc="04090005" w:tentative="1">
-      <w:start w:val="1"/>
-      <w:numFmt w:val="bullet"/>
-      <w:lvlText w:val=""/>
-      <w:lvlJc w:val="left"/>
-      <w:pPr>
-        <w:ind w:left="4320" w:hanging="360"/>
-      </w:pPr>
-      <w:rPr>
-        <w:rFonts w:ascii="Wingdings" w:hAnsi="Wingdings" w:hint="default"/>
-      </w:rPr>
-    </w:lvl>
-    <w:lvl w:ilvl="6" w:tplc="04090001" w:tentative="1">
-      <w:start w:val="1"/>
-      <w:numFmt w:val="bullet"/>
-      <w:lvlText w:val=""/>
-      <w:lvlJc w:val="left"/>
-      <w:pPr>
-        <w:ind w:left="5040" w:hanging="360"/>
-      </w:pPr>
-      <w:rPr>
-        <w:rFonts w:ascii="Symbol" w:hAnsi="Symbol" w:hint="default"/>
-      </w:rPr>
-    </w:lvl>
-    <w:lvl w:ilvl="7" w:tplc="04090003" w:tentative="1">
-      <w:start w:val="1"/>
-      <w:numFmt w:val="bullet"/>
-      <w:lvlText w:val="o"/>
-      <w:lvlJc w:val="left"/>
-      <w:pPr>
-        <w:ind w:left="5760" w:hanging="360"/>
-      </w:pPr>
-      <w:rPr>
-        <w:rFonts w:ascii="Courier New" w:hAnsi="Courier New" w:cs="Courier New" w:hint="default"/>
-      </w:rPr>
-    </w:lvl>
-    <w:lvl w:ilvl="8" w:tplc="04090005" w:tentative="1">
-      <w:start w:val="1"/>
-      <w:numFmt w:val="bullet"/>
-      <w:lvlText w:val=""/>
-      <w:lvlJc w:val="left"/>
-      <w:pPr>
-        <w:ind w:left="6480" w:hanging="360"/>
-      </w:pPr>
-      <w:rPr>
-        <w:rFonts w:ascii="Wingdings" w:hAnsi="Wingdings" w:hint="default"/>
-      </w:rPr>
-    </w:lvl>
-  </w:abstractNum>
-  <w:abstractNum w:abstractNumId="7" w15:restartNumberingAfterBreak="0">
     <w:nsid w:val="23C61833"/>
     <w:multiLevelType w:val="hybridMultilevel"/>
     <w:tmpl w:val="3B2C6526"/>
@@ -2925,7 +2782,7 @@
       </w:rPr>
     </w:lvl>
   </w:abstractNum>
-  <w:abstractNum w:abstractNumId="8" w15:restartNumberingAfterBreak="0">
+  <w:abstractNum w:abstractNumId="7" w15:restartNumberingAfterBreak="0">
     <w:nsid w:val="26153F2A"/>
     <w:multiLevelType w:val="hybridMultilevel"/>
     <w:tmpl w:val="90AA5F6E"/>
@@ -3037,7 +2894,7 @@
       </w:rPr>
     </w:lvl>
   </w:abstractNum>
-  <w:abstractNum w:abstractNumId="9" w15:restartNumberingAfterBreak="0">
+  <w:abstractNum w:abstractNumId="8" w15:restartNumberingAfterBreak="0">
     <w:nsid w:val="26C76313"/>
     <w:multiLevelType w:val="multilevel"/>
     <w:tmpl w:val="2912089C"/>
@@ -3150,119 +3007,7 @@
       </w:rPr>
     </w:lvl>
   </w:abstractNum>
-  <w:abstractNum w:abstractNumId="10" w15:restartNumberingAfterBreak="0">
-    <w:nsid w:val="334D454F"/>
-    <w:multiLevelType w:val="hybridMultilevel"/>
-    <w:tmpl w:val="77F20ED2"/>
-    <w:lvl w:ilvl="0" w:tplc="82C8935E">
-      <w:numFmt w:val="bullet"/>
-      <w:lvlText w:val="-"/>
-      <w:lvlJc w:val="left"/>
-      <w:pPr>
-        <w:ind w:left="720" w:hanging="360"/>
-      </w:pPr>
-      <w:rPr>
-        <w:rFonts w:ascii="Calibri" w:eastAsia="Spectral" w:hAnsi="Calibri" w:cs="Calibri" w:hint="default"/>
-      </w:rPr>
-    </w:lvl>
-    <w:lvl w:ilvl="1" w:tplc="04090003" w:tentative="1">
-      <w:start w:val="1"/>
-      <w:numFmt w:val="bullet"/>
-      <w:lvlText w:val="o"/>
-      <w:lvlJc w:val="left"/>
-      <w:pPr>
-        <w:ind w:left="1440" w:hanging="360"/>
-      </w:pPr>
-      <w:rPr>
-        <w:rFonts w:ascii="Courier New" w:hAnsi="Courier New" w:cs="Courier New" w:hint="default"/>
-      </w:rPr>
-    </w:lvl>
-    <w:lvl w:ilvl="2" w:tplc="04090005" w:tentative="1">
-      <w:start w:val="1"/>
-      <w:numFmt w:val="bullet"/>
-      <w:lvlText w:val=""/>
-      <w:lvlJc w:val="left"/>
-      <w:pPr>
-        <w:ind w:left="2160" w:hanging="360"/>
-      </w:pPr>
-      <w:rPr>
-        <w:rFonts w:ascii="Wingdings" w:hAnsi="Wingdings" w:hint="default"/>
-      </w:rPr>
-    </w:lvl>
-    <w:lvl w:ilvl="3" w:tplc="04090001" w:tentative="1">
-      <w:start w:val="1"/>
-      <w:numFmt w:val="bullet"/>
-      <w:lvlText w:val=""/>
-      <w:lvlJc w:val="left"/>
-      <w:pPr>
-        <w:ind w:left="2880" w:hanging="360"/>
-      </w:pPr>
-      <w:rPr>
-        <w:rFonts w:ascii="Symbol" w:hAnsi="Symbol" w:hint="default"/>
-      </w:rPr>
-    </w:lvl>
-    <w:lvl w:ilvl="4" w:tplc="04090003" w:tentative="1">
-      <w:start w:val="1"/>
-      <w:numFmt w:val="bullet"/>
-      <w:lvlText w:val="o"/>
-      <w:lvlJc w:val="left"/>
-      <w:pPr>
-        <w:ind w:left="3600" w:hanging="360"/>
-      </w:pPr>
-      <w:rPr>
-        <w:rFonts w:ascii="Courier New" w:hAnsi="Courier New" w:cs="Courier New" w:hint="default"/>
-      </w:rPr>
-    </w:lvl>
-    <w:lvl w:ilvl="5" w:tplc="04090005" w:tentative="1">
-      <w:start w:val="1"/>
-      <w:numFmt w:val="bullet"/>
-      <w:lvlText w:val=""/>
-      <w:lvlJc w:val="left"/>
-      <w:pPr>
-        <w:ind w:left="4320" w:hanging="360"/>
-      </w:pPr>
-      <w:rPr>
-        <w:rFonts w:ascii="Wingdings" w:hAnsi="Wingdings" w:hint="default"/>
-      </w:rPr>
-    </w:lvl>
-    <w:lvl w:ilvl="6" w:tplc="04090001" w:tentative="1">
-      <w:start w:val="1"/>
-      <w:numFmt w:val="bullet"/>
-      <w:lvlText w:val=""/>
-      <w:lvlJc w:val="left"/>
-      <w:pPr>
-        <w:ind w:left="5040" w:hanging="360"/>
-      </w:pPr>
-      <w:rPr>
-        <w:rFonts w:ascii="Symbol" w:hAnsi="Symbol" w:hint="default"/>
-      </w:rPr>
-    </w:lvl>
-    <w:lvl w:ilvl="7" w:tplc="04090003" w:tentative="1">
-      <w:start w:val="1"/>
-      <w:numFmt w:val="bullet"/>
-      <w:lvlText w:val="o"/>
-      <w:lvlJc w:val="left"/>
-      <w:pPr>
-        <w:ind w:left="5760" w:hanging="360"/>
-      </w:pPr>
-      <w:rPr>
-        <w:rFonts w:ascii="Courier New" w:hAnsi="Courier New" w:cs="Courier New" w:hint="default"/>
-      </w:rPr>
-    </w:lvl>
-    <w:lvl w:ilvl="8" w:tplc="04090005" w:tentative="1">
-      <w:start w:val="1"/>
-      <w:numFmt w:val="bullet"/>
-      <w:lvlText w:val=""/>
-      <w:lvlJc w:val="left"/>
-      <w:pPr>
-        <w:ind w:left="6480" w:hanging="360"/>
-      </w:pPr>
-      <w:rPr>
-        <w:rFonts w:ascii="Wingdings" w:hAnsi="Wingdings" w:hint="default"/>
-      </w:rPr>
-    </w:lvl>
-  </w:abstractNum>
-  <w:abstractNum w:abstractNumId="11" w15:restartNumberingAfterBreak="0">
+  <w:abstractNum w:abstractNumId="9" w15:restartNumberingAfterBreak="0">
     <w:nsid w:val="36D1280F"/>
     <w:multiLevelType w:val="hybridMultilevel"/>
     <w:tmpl w:val="23E0C6D8"/>
@@ -3375,7 +3120,7 @@
       </w:rPr>
     </w:lvl>
   </w:abstractNum>
-  <w:abstractNum w:abstractNumId="12" w15:restartNumberingAfterBreak="0">
+  <w:abstractNum w:abstractNumId="10" w15:restartNumberingAfterBreak="0">
     <w:nsid w:val="38166087"/>
     <w:multiLevelType w:val="hybridMultilevel"/>
     <w:tmpl w:val="DAC43234"/>
@@ -3488,7 +3233,7 @@
       </w:rPr>
     </w:lvl>
   </w:abstractNum>
-  <w:abstractNum w:abstractNumId="13" w15:restartNumberingAfterBreak="0">
+  <w:abstractNum w:abstractNumId="11" w15:restartNumberingAfterBreak="0">
     <w:nsid w:val="3C821678"/>
     <w:multiLevelType w:val="hybridMultilevel"/>
     <w:tmpl w:val="7D267D3E"/>
@@ -3601,7 +3346,7 @@
       </w:rPr>
     </w:lvl>
   </w:abstractNum>
-  <w:abstractNum w:abstractNumId="14" w15:restartNumberingAfterBreak="0">
+  <w:abstractNum w:abstractNumId="12" w15:restartNumberingAfterBreak="0">
     <w:nsid w:val="3CEA2FE6"/>
     <w:multiLevelType w:val="multilevel"/>
     <w:tmpl w:val="70F28312"/>
@@ -3714,7 +3459,7 @@
       </w:rPr>
     </w:lvl>
   </w:abstractNum>
-  <w:abstractNum w:abstractNumId="15" w15:restartNumberingAfterBreak="0">
+  <w:abstractNum w:abstractNumId="13" w15:restartNumberingAfterBreak="0">
     <w:nsid w:val="3E1329BE"/>
     <w:multiLevelType w:val="hybridMultilevel"/>
     <w:tmpl w:val="2E8E5B5C"/>
@@ -3827,7 +3572,7 @@
       </w:rPr>
     </w:lvl>
   </w:abstractNum>
-  <w:abstractNum w:abstractNumId="16" w15:restartNumberingAfterBreak="0">
+  <w:abstractNum w:abstractNumId="14" w15:restartNumberingAfterBreak="0">
     <w:nsid w:val="402C2B7E"/>
     <w:multiLevelType w:val="multilevel"/>
     <w:tmpl w:val="9970DECA"/>
@@ -3940,119 +3685,7 @@
       </w:rPr>
     </w:lvl>
   </w:abstractNum>
-  <w:abstractNum w:abstractNumId="17" w15:restartNumberingAfterBreak="0">
-    <w:nsid w:val="428F1DE0"/>
-    <w:multiLevelType w:val="hybridMultilevel"/>
-    <w:tmpl w:val="12BE56C0"/>
-    <w:lvl w:ilvl="0" w:tplc="82C8935E">
-      <w:numFmt w:val="bullet"/>
-      <w:lvlText w:val="-"/>
-      <w:lvlJc w:val="left"/>
-      <w:pPr>
-        <w:ind w:left="720" w:hanging="360"/>
-      </w:pPr>
-      <w:rPr>
-        <w:rFonts w:ascii="Calibri" w:eastAsia="Spectral" w:hAnsi="Calibri" w:cs="Calibri" w:hint="default"/>
-      </w:rPr>
-    </w:lvl>
-    <w:lvl w:ilvl="1" w:tplc="04090003" w:tentative="1">
-      <w:start w:val="1"/>
-      <w:numFmt w:val="bullet"/>
-      <w:lvlText w:val="o"/>
-      <w:lvlJc w:val="left"/>
-      <w:pPr>
-        <w:ind w:left="1440" w:hanging="360"/>
-      </w:pPr>
-      <w:rPr>
-        <w:rFonts w:ascii="Courier New" w:hAnsi="Courier New" w:cs="Courier New" w:hint="default"/>
-      </w:rPr>
-    </w:lvl>
-    <w:lvl w:ilvl="2" w:tplc="04090005" w:tentative="1">
-      <w:start w:val="1"/>
-      <w:numFmt w:val="bullet"/>
-      <w:lvlText w:val=""/>
-      <w:lvlJc w:val="left"/>
-      <w:pPr>
-        <w:ind w:left="2160" w:hanging="360"/>
-      </w:pPr>
-      <w:rPr>
-        <w:rFonts w:ascii="Wingdings" w:hAnsi="Wingdings" w:hint="default"/>
-      </w:rPr>
-    </w:lvl>
-    <w:lvl w:ilvl="3" w:tplc="04090001" w:tentative="1">
-      <w:start w:val="1"/>
-      <w:numFmt w:val="bullet"/>
-      <w:lvlText w:val=""/>
-      <w:lvlJc w:val="left"/>
-      <w:pPr>
-        <w:ind w:left="2880" w:hanging="360"/>
-      </w:pPr>
-      <w:rPr>
-        <w:rFonts w:ascii="Symbol" w:hAnsi="Symbol" w:hint="default"/>
-      </w:rPr>
-    </w:lvl>
-    <w:lvl w:ilvl="4" w:tplc="04090003" w:tentative="1">
-      <w:start w:val="1"/>
-      <w:numFmt w:val="bullet"/>
-      <w:lvlText w:val="o"/>
-      <w:lvlJc w:val="left"/>
-      <w:pPr>
-        <w:ind w:left="3600" w:hanging="360"/>
-      </w:pPr>
-      <w:rPr>
-        <w:rFonts w:ascii="Courier New" w:hAnsi="Courier New" w:cs="Courier New" w:hint="default"/>
-      </w:rPr>
-    </w:lvl>
-    <w:lvl w:ilvl="5" w:tplc="04090005" w:tentative="1">
-      <w:start w:val="1"/>
-      <w:numFmt w:val="bullet"/>
-      <w:lvlText w:val=""/>
-      <w:lvlJc w:val="left"/>
-      <w:pPr>
-        <w:ind w:left="4320" w:hanging="360"/>
-      </w:pPr>
-      <w:rPr>
-        <w:rFonts w:ascii="Wingdings" w:hAnsi="Wingdings" w:hint="default"/>
-      </w:rPr>
-    </w:lvl>
-    <w:lvl w:ilvl="6" w:tplc="04090001" w:tentative="1">
-      <w:start w:val="1"/>
-      <w:numFmt w:val="bullet"/>
-      <w:lvlText w:val=""/>
-      <w:lvlJc w:val="left"/>
-      <w:pPr>
-        <w:ind w:left="5040" w:hanging="360"/>
-      </w:pPr>
-      <w:rPr>
-        <w:rFonts w:ascii="Symbol" w:hAnsi="Symbol" w:hint="default"/>
-      </w:rPr>
-    </w:lvl>
-    <w:lvl w:ilvl="7" w:tplc="04090003" w:tentative="1">
-      <w:start w:val="1"/>
-      <w:numFmt w:val="bullet"/>
-      <w:lvlText w:val="o"/>
-      <w:lvlJc w:val="left"/>
-      <w:pPr>
-        <w:ind w:left="5760" w:hanging="360"/>
-      </w:pPr>
-      <w:rPr>
-        <w:rFonts w:ascii="Courier New" w:hAnsi="Courier New" w:cs="Courier New" w:hint="default"/>
-      </w:rPr>
-    </w:lvl>
-    <w:lvl w:ilvl="8" w:tplc="04090005" w:tentative="1">
-      <w:start w:val="1"/>
-      <w:numFmt w:val="bullet"/>
-      <w:lvlText w:val=""/>
-      <w:lvlJc w:val="left"/>
-      <w:pPr>
-        <w:ind w:left="6480" w:hanging="360"/>
-      </w:pPr>
-      <w:rPr>
-        <w:rFonts w:ascii="Wingdings" w:hAnsi="Wingdings" w:hint="default"/>
-      </w:rPr>
-    </w:lvl>
-  </w:abstractNum>
-  <w:abstractNum w:abstractNumId="18" w15:restartNumberingAfterBreak="0">
+  <w:abstractNum w:abstractNumId="15" w15:restartNumberingAfterBreak="0">
     <w:nsid w:val="4AFA1A62"/>
     <w:multiLevelType w:val="hybridMultilevel"/>
     <w:tmpl w:val="BF56CEC6"/>
@@ -4165,7 +3798,7 @@
       </w:rPr>
     </w:lvl>
   </w:abstractNum>
-  <w:abstractNum w:abstractNumId="19" w15:restartNumberingAfterBreak="0">
+  <w:abstractNum w:abstractNumId="16" w15:restartNumberingAfterBreak="0">
     <w:nsid w:val="520712C4"/>
     <w:multiLevelType w:val="hybridMultilevel"/>
     <w:tmpl w:val="B8040AAA"/>
@@ -4278,7 +3911,7 @@
       </w:rPr>
     </w:lvl>
   </w:abstractNum>
-  <w:abstractNum w:abstractNumId="20" w15:restartNumberingAfterBreak="0">
+  <w:abstractNum w:abstractNumId="17" w15:restartNumberingAfterBreak="0">
     <w:nsid w:val="54FD2FAF"/>
     <w:multiLevelType w:val="hybridMultilevel"/>
     <w:tmpl w:val="30B28308"/>
@@ -4391,119 +4024,7 @@
       </w:rPr>
     </w:lvl>
   </w:abstractNum>
-  <w:abstractNum w:abstractNumId="21" w15:restartNumberingAfterBreak="0">
-    <w:nsid w:val="5D217CA8"/>
-    <w:multiLevelType w:val="hybridMultilevel"/>
-    <w:tmpl w:val="0FB4B34A"/>
-    <w:lvl w:ilvl="0" w:tplc="82C8935E">
-      <w:numFmt w:val="bullet"/>
-      <w:lvlText w:val="-"/>
-      <w:lvlJc w:val="left"/>
-      <w:pPr>
-        <w:ind w:left="720" w:hanging="360"/>
-      </w:pPr>
-      <w:rPr>
-        <w:rFonts w:ascii="Calibri" w:eastAsia="Spectral" w:hAnsi="Calibri" w:cs="Calibri" w:hint="default"/>
-      </w:rPr>
-    </w:lvl>
-    <w:lvl w:ilvl="1" w:tplc="04090003" w:tentative="1">
-      <w:start w:val="1"/>
-      <w:numFmt w:val="bullet"/>
-      <w:lvlText w:val="o"/>
-      <w:lvlJc w:val="left"/>
-      <w:pPr>
-        <w:ind w:left="1440" w:hanging="360"/>
-      </w:pPr>
-      <w:rPr>
-        <w:rFonts w:ascii="Courier New" w:hAnsi="Courier New" w:cs="Courier New" w:hint="default"/>
-      </w:rPr>
-    </w:lvl>
-    <w:lvl w:ilvl="2" w:tplc="04090005" w:tentative="1">
-      <w:start w:val="1"/>
-      <w:numFmt w:val="bullet"/>
-      <w:lvlText w:val=""/>
-      <w:lvlJc w:val="left"/>
-      <w:pPr>
-        <w:ind w:left="2160" w:hanging="360"/>
-      </w:pPr>
-      <w:rPr>
-        <w:rFonts w:ascii="Wingdings" w:hAnsi="Wingdings" w:hint="default"/>
-      </w:rPr>
-    </w:lvl>
-    <w:lvl w:ilvl="3" w:tplc="04090001" w:tentative="1">
-      <w:start w:val="1"/>
-      <w:numFmt w:val="bullet"/>
-      <w:lvlText w:val=""/>
-      <w:lvlJc w:val="left"/>
-      <w:pPr>
-        <w:ind w:left="2880" w:hanging="360"/>
-      </w:pPr>
-      <w:rPr>
-        <w:rFonts w:ascii="Symbol" w:hAnsi="Symbol" w:hint="default"/>
-      </w:rPr>
-    </w:lvl>
-    <w:lvl w:ilvl="4" w:tplc="04090003" w:tentative="1">
-      <w:start w:val="1"/>
-      <w:numFmt w:val="bullet"/>
-      <w:lvlText w:val="o"/>
-      <w:lvlJc w:val="left"/>
-      <w:pPr>
-        <w:ind w:left="3600" w:hanging="360"/>
-      </w:pPr>
-      <w:rPr>
-        <w:rFonts w:ascii="Courier New" w:hAnsi="Courier New" w:cs="Courier New" w:hint="default"/>
-      </w:rPr>
-    </w:lvl>
-    <w:lvl w:ilvl="5" w:tplc="04090005" w:tentative="1">
-      <w:start w:val="1"/>
-      <w:numFmt w:val="bullet"/>
-      <w:lvlText w:val=""/>
-      <w:lvlJc w:val="left"/>
-      <w:pPr>
-        <w:ind w:left="4320" w:hanging="360"/>
-      </w:pPr>
-      <w:rPr>
-        <w:rFonts w:ascii="Wingdings" w:hAnsi="Wingdings" w:hint="default"/>
-      </w:rPr>
-    </w:lvl>
-    <w:lvl w:ilvl="6" w:tplc="04090001" w:tentative="1">
-      <w:start w:val="1"/>
-      <w:numFmt w:val="bullet"/>
-      <w:lvlText w:val=""/>
-      <w:lvlJc w:val="left"/>
-      <w:pPr>
-        <w:ind w:left="5040" w:hanging="360"/>
-      </w:pPr>
-      <w:rPr>
-        <w:rFonts w:ascii="Symbol" w:hAnsi="Symbol" w:hint="default"/>
-      </w:rPr>
-    </w:lvl>
-    <w:lvl w:ilvl="7" w:tplc="04090003" w:tentative="1">
-      <w:start w:val="1"/>
-      <w:numFmt w:val="bullet"/>
-      <w:lvlText w:val="o"/>
-      <w:lvlJc w:val="left"/>
-      <w:pPr>
-        <w:ind w:left="5760" w:hanging="360"/>
-      </w:pPr>
-      <w:rPr>
-        <w:rFonts w:ascii="Courier New" w:hAnsi="Courier New" w:cs="Courier New" w:hint="default"/>
-      </w:rPr>
-    </w:lvl>
-    <w:lvl w:ilvl="8" w:tplc="04090005" w:tentative="1">
-      <w:start w:val="1"/>
-      <w:numFmt w:val="bullet"/>
-      <w:lvlText w:val=""/>
-      <w:lvlJc w:val="left"/>
-      <w:pPr>
-        <w:ind w:left="6480" w:hanging="360"/>
-      </w:pPr>
-      <w:rPr>
-        <w:rFonts w:ascii="Wingdings" w:hAnsi="Wingdings" w:hint="default"/>
-      </w:rPr>
-    </w:lvl>
-  </w:abstractNum>
-  <w:abstractNum w:abstractNumId="22" w15:restartNumberingAfterBreak="0">
+  <w:abstractNum w:abstractNumId="18" w15:restartNumberingAfterBreak="0">
     <w:nsid w:val="7ABF5739"/>
     <w:multiLevelType w:val="multilevel"/>
     <w:tmpl w:val="CD583D32"/>
@@ -4620,31 +4141,31 @@
     <w:abstractNumId w:val="0"/>
   </w:num>
   <w:num w:numId="2" w16cid:durableId="968583544">
-    <w:abstractNumId w:val="22"/>
+    <w:abstractNumId w:val="18"/>
   </w:num>
   <w:num w:numId="3" w16cid:durableId="39283691">
-    <w:abstractNumId w:val="9"/>
+    <w:abstractNumId w:val="8"/>
   </w:num>
   <w:num w:numId="4" w16cid:durableId="1352997362">
-    <w:abstractNumId w:val="16"/>
+    <w:abstractNumId w:val="14"/>
   </w:num>
   <w:num w:numId="5" w16cid:durableId="366837349">
-    <w:abstractNumId w:val="14"/>
+    <w:abstractNumId w:val="12"/>
   </w:num>
   <w:num w:numId="6" w16cid:durableId="704644527">
-    <w:abstractNumId w:val="18"/>
+    <w:abstractNumId w:val="15"/>
   </w:num>
   <w:num w:numId="7" w16cid:durableId="1049299726">
-    <w:abstractNumId w:val="20"/>
+    <w:abstractNumId w:val="17"/>
   </w:num>
   <w:num w:numId="8" w16cid:durableId="1777598942">
-    <w:abstractNumId w:val="15"/>
+    <w:abstractNumId w:val="13"/>
   </w:num>
   <w:num w:numId="9" w16cid:durableId="1306933773">
-    <w:abstractNumId w:val="13"/>
+    <w:abstractNumId w:val="11"/>
   </w:num>
   <w:num w:numId="10" w16cid:durableId="1230310561">
-    <w:abstractNumId w:val="7"/>
+    <w:abstractNumId w:val="6"/>
   </w:num>
   <w:num w:numId="11" w16cid:durableId="1226989858">
     <w:abstractNumId w:val="1"/>
@@ -4653,13 +4174,13 @@
     <w:abstractNumId w:val="4"/>
   </w:num>
   <w:num w:numId="13" w16cid:durableId="939945959">
-    <w:abstractNumId w:val="11"/>
+    <w:abstractNumId w:val="9"/>
   </w:num>
   <w:num w:numId="14" w16cid:durableId="741176075">
-    <w:abstractNumId w:val="12"/>
+    <w:abstractNumId w:val="10"/>
   </w:num>
   <w:num w:numId="15" w16cid:durableId="790435444">
-    <w:abstractNumId w:val="8"/>
+    <w:abstractNumId w:val="7"/>
   </w:num>
   <w:num w:numId="16" w16cid:durableId="388959194">
     <w:abstractNumId w:val="5"/>
@@ -4668,22 +4189,10 @@
     <w:abstractNumId w:val="3"/>
   </w:num>
   <w:num w:numId="18" w16cid:durableId="565920947">
-    <w:abstractNumId w:val="19"/>
+    <w:abstractNumId w:val="16"/>
   </w:num>
   <w:num w:numId="19" w16cid:durableId="1889759751">
     <w:abstractNumId w:val="2"/>
-  </w:num>
-  <w:num w:numId="20" w16cid:durableId="243952748">
-    <w:abstractNumId w:val="17"/>
-  </w:num>
-  <w:num w:numId="21" w16cid:durableId="86466520">
-    <w:abstractNumId w:val="10"/>
-  </w:num>
-  <w:num w:numId="22" w16cid:durableId="935989677">
-    <w:abstractNumId w:val="21"/>
-  </w:num>
-  <w:num w:numId="23" w16cid:durableId="23749986">
-    <w:abstractNumId w:val="6"/>
   </w:num>
 </w:numbering>
 </file>

</xml_diff>